<commit_message>
Agrega UX (2.4) y teoria del PUDS (7) a la Parte I del documento
Ingenieria Humana / Experiencia de Usuario (ISO 9241-210) aplicada a
las decisiones reales de UI del proyecto (tour guiado, leyenda UML,
feedback inmediato de validacion/bloqueo colaborativo, agrupacion de
la barra de herramientas), y una seccion teorica sobre el PUDS (fases
y metodologias) que conecta con el desarrollo real por sprints ya
documentado en la Parte 4 (Scrum).

Co-Authored-By: Claude Sonnet 5 <noreply@anthropic.com>
</commit_message>
<xml_diff>
--- a/docs/Documentacion_del_Proyecto.docx
+++ b/docs/Documentacion_del_Proyecto.docx
@@ -495,6 +495,105 @@
       </w:pPr>
       <w:r>
         <w:t xml:space="preserve">Aplicando este marco a la herramienta desarrollada, el diferencial que se busca (el “sello”) es la integración de capacidades que, por separado, sí existen en el mercado —canvas de modelado UML colaborativo por un lado, generadores de código a partir de modelos por otro— pero que rara vez conviven en una misma herramienta con foco explícito en la generación de un backend completo, validación lógica automática del modelo y un asistente de IA que edita el diagrama por operaciones puntuales en vez de regenerarlo. En cuanto a estar “terminado, probado y con garantía” en el sentido estricto aquí definido, el proyecto se ubica todavía en la etapa de prototipo funcional verificado técnicamente, no en la de un producto listo para el mercado —una distinción relevante para no sobreestimar su madurez actual frente a la definición desarrollada en esta sección.</w:t>
+      </w:r>
+    </w:p>
+    <w:p>
+      <w:pPr>
+        <w:pStyle w:val="Heading2"/>
+        <w:spacing w:after="150" w:before="300"/>
+      </w:pPr>
+      <w:r>
+        <w:t xml:space="preserve">2.4. Ingeniería Humana (Experiencia del Usuario — UX)</w:t>
+      </w:r>
+    </w:p>
+    <w:p>
+      <w:r>
+        <w:t xml:space="preserve">La Experiencia de Usuario (UX) se centra en cómo las personas interactúan con un sistema, evaluando facilidad de uso, accesibilidad, eficiencia, satisfacción y consistencia. Según la norma ISO 9241-210, la UX es “la respuesta de una persona que resulta del uso o la anticipación del uso de un producto, sistema o servicio”. En una herramienta CASE, donde el usuario pasa la mayor parte del tiempo manipulando un modelo visual, estos principios no son un añadido cosmético: determinan directamente qué tan rápido alguien puede pasar de una idea a un diagrama correcto.</w:t>
+      </w:r>
+    </w:p>
+    <w:p>
+      <w:r>
+        <w:t xml:space="preserve">Aplicación al proyecto:</w:t>
+      </w:r>
+    </w:p>
+    <w:p>
+      <w:pPr>
+        <w:pStyle w:val="ListParagraph"/>
+        <w:numPr>
+          <w:ilvl w:val="0"/>
+          <w:numId w:val="2"/>
+        </w:numPr>
+        <w:spacing w:after="100"/>
+      </w:pPr>
+      <w:r>
+        <w:rPr>
+          <w:b/>
+          <w:bCs/>
+        </w:rPr>
+        <w:t xml:space="preserve">Facilidad de uso y curva de aprendizaje:</w:t>
+      </w:r>
+      <w:r>
+        <w:t xml:space="preserve"> un recorrido guiado interactivo (tour paso a paso) introduce cada función del lienzo la primera vez que se usa la herramienta, y una leyenda de notación UML permanente en el propio lienzo recuerda el significado de cada símbolo (triángulo hueco, rombos, línea punteada) sin obligar al usuario a salir de la aplicación para consultarlo.</w:t>
+      </w:r>
+    </w:p>
+    <w:p>
+      <w:pPr>
+        <w:pStyle w:val="ListParagraph"/>
+        <w:numPr>
+          <w:ilvl w:val="0"/>
+          <w:numId w:val="2"/>
+        </w:numPr>
+        <w:spacing w:after="100"/>
+      </w:pPr>
+      <w:r>
+        <w:rPr>
+          <w:b/>
+          <w:bCs/>
+        </w:rPr>
+        <w:t xml:space="preserve">Retroalimentación inmediata:</w:t>
+      </w:r>
+      <w:r>
+        <w:t xml:space="preserve"> la validación lógica del modelo, el deshacer/rehacer, y el bloqueo visual de una clase que otro usuario está editando en ese momento le devuelven al usuario el estado del sistema sin que tenga que adivinarlo.</w:t>
+      </w:r>
+    </w:p>
+    <w:p>
+      <w:pPr>
+        <w:pStyle w:val="ListParagraph"/>
+        <w:numPr>
+          <w:ilvl w:val="0"/>
+          <w:numId w:val="2"/>
+        </w:numPr>
+        <w:spacing w:after="100"/>
+      </w:pPr>
+      <w:r>
+        <w:rPr>
+          <w:b/>
+          <w:bCs/>
+        </w:rPr>
+        <w:t xml:space="preserve">Reducción de carga cognitiva:</w:t>
+      </w:r>
+      <w:r>
+        <w:t xml:space="preserve"> la barra de herramientas agrupa las acciones por función (edición, archivo, herramientas) en lugar de exponer una fila plana de botones sueltos, y las acciones menos frecuentes (importar, exportar, documentación, bitácora) se recogen en un menú desplegable “Archivo” en vez de competir visualmente con las acciones de uso constante.</w:t>
+      </w:r>
+    </w:p>
+    <w:p>
+      <w:pPr>
+        <w:pStyle w:val="ListParagraph"/>
+        <w:numPr>
+          <w:ilvl w:val="0"/>
+          <w:numId w:val="2"/>
+        </w:numPr>
+        <w:spacing w:after="100"/>
+      </w:pPr>
+      <w:r>
+        <w:rPr>
+          <w:b/>
+          <w:bCs/>
+        </w:rPr>
+        <w:t xml:space="preserve">Consistencia:</w:t>
+      </w:r>
+      <w:r>
+        <w:t xml:space="preserve"> la misma semántica de multiplicidad y estereotipo se respeta en tres representaciones distintas del mismo modelo — el lienzo interactivo, el archivo XMI exportado y el código Java generado — evitando que el usuario tenga que reconciliar información contradictoria entre ellas.</w:t>
       </w:r>
     </w:p>
     <w:p>
@@ -1293,6 +1392,248 @@
       </w:pPr>
       <w:r>
         <w:t xml:space="preserve">Se validó el flujo completo de extremo a extremo: se generó un backend a partir de un diagrama de prueba, se compiló con Maven, se ejecutó localmente contra una base de datos PostgreSQL real, y se probó cada endpoint (crear, listar, actualizar, eliminar) mediante peticiones HTTP equivalentes a Postman. Esta verificación práctica permitió detectar y corregir en la propia plantilla generadora los dos problemas de serialización JSON mencionados en 6.1, garantizando que todo backend generado a partir de ese momento los tenga resueltos de forma permanente.</w:t>
+      </w:r>
+    </w:p>
+    <w:p>
+      <w:pPr>
+        <w:pStyle w:val="Heading1"/>
+        <w:spacing w:after="200" w:before="500"/>
+      </w:pPr>
+      <w:r>
+        <w:t xml:space="preserve">7. El Proceso de Desarrollo de Software (PUDS)</w:t>
+      </w:r>
+    </w:p>
+    <w:p>
+      <w:r>
+        <w:t xml:space="preserve">El Proceso Unificado de Desarrollo de Software (PUDS) es un marco estructurado que organiza las actividades necesarias para construir un sistema, desde la captura de requisitos hasta la entrega y el mantenimiento del producto final. Su propósito es garantizar que el software cumpla los objetivos establecidos dentro de un tiempo y alcance definidos, reduciendo riesgos y ordenando la coordinación del equipo de trabajo.</w:t>
+      </w:r>
+    </w:p>
+    <w:p>
+      <w:pPr>
+        <w:pStyle w:val="Heading2"/>
+        <w:spacing w:after="150" w:before="300"/>
+      </w:pPr>
+      <w:r>
+        <w:t xml:space="preserve">7.1. Fases del PUDS</w:t>
+      </w:r>
+    </w:p>
+    <w:p>
+      <w:pPr>
+        <w:pStyle w:val="ListParagraph"/>
+        <w:numPr>
+          <w:ilvl w:val="0"/>
+          <w:numId w:val="2"/>
+        </w:numPr>
+        <w:spacing w:after="100"/>
+      </w:pPr>
+      <w:r>
+        <w:rPr>
+          <w:b/>
+          <w:bCs/>
+        </w:rPr>
+        <w:t xml:space="preserve">Análisis de requisitos:</w:t>
+      </w:r>
+      <w:r>
+        <w:t xml:space="preserve"> identificación y documentación de las necesidades del usuario y del negocio.</w:t>
+      </w:r>
+    </w:p>
+    <w:p>
+      <w:pPr>
+        <w:pStyle w:val="ListParagraph"/>
+        <w:numPr>
+          <w:ilvl w:val="0"/>
+          <w:numId w:val="2"/>
+        </w:numPr>
+        <w:spacing w:after="100"/>
+      </w:pPr>
+      <w:r>
+        <w:rPr>
+          <w:b/>
+          <w:bCs/>
+        </w:rPr>
+        <w:t xml:space="preserve">Diseño del sistema:</w:t>
+      </w:r>
+      <w:r>
+        <w:t xml:space="preserve"> definición de la arquitectura, los componentes y su integración.</w:t>
+      </w:r>
+    </w:p>
+    <w:p>
+      <w:pPr>
+        <w:pStyle w:val="ListParagraph"/>
+        <w:numPr>
+          <w:ilvl w:val="0"/>
+          <w:numId w:val="2"/>
+        </w:numPr>
+        <w:spacing w:after="100"/>
+      </w:pPr>
+      <w:r>
+        <w:rPr>
+          <w:b/>
+          <w:bCs/>
+        </w:rPr>
+        <w:t xml:space="preserve">Implementación:</w:t>
+      </w:r>
+      <w:r>
+        <w:t xml:space="preserve"> traducción del diseño en código funcional.</w:t>
+      </w:r>
+    </w:p>
+    <w:p>
+      <w:pPr>
+        <w:pStyle w:val="ListParagraph"/>
+        <w:numPr>
+          <w:ilvl w:val="0"/>
+          <w:numId w:val="2"/>
+        </w:numPr>
+        <w:spacing w:after="100"/>
+      </w:pPr>
+      <w:r>
+        <w:rPr>
+          <w:b/>
+          <w:bCs/>
+        </w:rPr>
+        <w:t xml:space="preserve">Pruebas:</w:t>
+      </w:r>
+      <w:r>
+        <w:t xml:space="preserve"> validación de que el sistema cumple los requisitos definidos.</w:t>
+      </w:r>
+    </w:p>
+    <w:p>
+      <w:pPr>
+        <w:pStyle w:val="ListParagraph"/>
+        <w:numPr>
+          <w:ilvl w:val="0"/>
+          <w:numId w:val="2"/>
+        </w:numPr>
+        <w:spacing w:after="100"/>
+      </w:pPr>
+      <w:r>
+        <w:rPr>
+          <w:b/>
+          <w:bCs/>
+        </w:rPr>
+        <w:t xml:space="preserve">Despliegue:</w:t>
+      </w:r>
+      <w:r>
+        <w:t xml:space="preserve"> puesta en marcha del sistema en un entorno accesible para los usuarios finales.</w:t>
+      </w:r>
+    </w:p>
+    <w:p>
+      <w:pPr>
+        <w:pStyle w:val="ListParagraph"/>
+        <w:numPr>
+          <w:ilvl w:val="0"/>
+          <w:numId w:val="2"/>
+        </w:numPr>
+        <w:spacing w:after="100"/>
+      </w:pPr>
+      <w:r>
+        <w:rPr>
+          <w:b/>
+          <w:bCs/>
+        </w:rPr>
+        <w:t xml:space="preserve">Mantenimiento:</w:t>
+      </w:r>
+      <w:r>
+        <w:t xml:space="preserve"> correcciones, adaptaciones y mejoras continuas una vez el sistema está en uso.</w:t>
+      </w:r>
+    </w:p>
+    <w:p>
+      <w:pPr>
+        <w:pStyle w:val="Heading2"/>
+        <w:spacing w:after="150" w:before="300"/>
+      </w:pPr>
+      <w:r>
+        <w:t xml:space="preserve">7.2. Metodologías dentro del PUDS</w:t>
+      </w:r>
+    </w:p>
+    <w:p>
+      <w:r>
+        <w:t xml:space="preserve">El PUDS es un marco de fases, no una metodología única: puede recorrerse con distintos enfoques de trabajo, entre ellos:</w:t>
+      </w:r>
+    </w:p>
+    <w:p>
+      <w:pPr>
+        <w:pStyle w:val="ListParagraph"/>
+        <w:numPr>
+          <w:ilvl w:val="0"/>
+          <w:numId w:val="2"/>
+        </w:numPr>
+        <w:spacing w:after="100"/>
+      </w:pPr>
+      <w:r>
+        <w:rPr>
+          <w:b/>
+          <w:bCs/>
+        </w:rPr>
+        <w:t xml:space="preserve">Modelo en cascada:</w:t>
+      </w:r>
+      <w:r>
+        <w:t xml:space="preserve"> las fases se ejecutan de forma secuencial y estructurada, una después de la otra.</w:t>
+      </w:r>
+    </w:p>
+    <w:p>
+      <w:pPr>
+        <w:pStyle w:val="ListParagraph"/>
+        <w:numPr>
+          <w:ilvl w:val="0"/>
+          <w:numId w:val="2"/>
+        </w:numPr>
+        <w:spacing w:after="100"/>
+      </w:pPr>
+      <w:r>
+        <w:rPr>
+          <w:b/>
+          <w:bCs/>
+        </w:rPr>
+        <w:t xml:space="preserve">Metodologías ágiles (Scrum, Kanban):</w:t>
+      </w:r>
+      <w:r>
+        <w:t xml:space="preserve"> promueven iteraciones cortas, entregas incrementales verificables y adaptación continua a cambios de requisitos.</w:t>
+      </w:r>
+    </w:p>
+    <w:p>
+      <w:pPr>
+        <w:pStyle w:val="ListParagraph"/>
+        <w:numPr>
+          <w:ilvl w:val="0"/>
+          <w:numId w:val="2"/>
+        </w:numPr>
+        <w:spacing w:after="100"/>
+      </w:pPr>
+      <w:r>
+        <w:rPr>
+          <w:b/>
+          <w:bCs/>
+        </w:rPr>
+        <w:t xml:space="preserve">Modelo incremental y evolutivo:</w:t>
+      </w:r>
+      <w:r>
+        <w:t xml:space="preserve"> el software se construye en etapas sucesivas, cada una añadiendo funcionalidad sobre la anterior.</w:t>
+      </w:r>
+    </w:p>
+    <w:p>
+      <w:pPr>
+        <w:pStyle w:val="ListParagraph"/>
+        <w:numPr>
+          <w:ilvl w:val="0"/>
+          <w:numId w:val="2"/>
+        </w:numPr>
+        <w:spacing w:after="100"/>
+      </w:pPr>
+      <w:r>
+        <w:rPr>
+          <w:b/>
+          <w:bCs/>
+        </w:rPr>
+        <w:t xml:space="preserve">Proceso Unificado (UP):</w:t>
+      </w:r>
+      <w:r>
+        <w:t xml:space="preserve"> desarrollo guiado por casos de uso, con énfasis en la gestión temprana de riesgos.</w:t>
+      </w:r>
+    </w:p>
+    <w:p>
+      <w:r>
+        <w:t xml:space="preserve">La Parte 2 de este documento desarrolla en detalle cómo se recorrieron las fases de análisis, diseño e implementación para este proyecto. Ese recorrido se complementó, además, con un enfoque ágil real de gestión por sprints (ver Parte 4 — Gestión ágil del proyecto con Scrum), de modo que las fases del PUDS no se ejecutaron una sola vez de forma lineal, sino de manera incremental a lo largo de varios ciclos cortos de entrega.</w:t>
       </w:r>
     </w:p>
     <w:p>

</xml_diff>

<commit_message>
Corrige numeracion de capitulos y agrega capitulo de Pruebas a la Parte II
Renumera Captura de Requisitos/Analisis/Diseno/Implementacion (saltaban
de 1 a 5) a la secuencia correcta 1-5, y agrega el capitulo 6 (Plan,
Diseno, Casos, Integracion, Sistema y Evaluacion de pruebas) grounded en
verificacion real ya hecha en el proyecto: la suite Vitest de
model-diff.util.ts, las pruebas con Postman del backend Spring Boot
generado, y los tres defectos reales encontrados y corregidos durante
el ensayo local previo al despliegue en AWS (rutas de Nginx, version de
Node/npm, variables de entorno).

Co-Authored-By: Claude Sonnet 5 <noreply@anthropic.com>
</commit_message>
<xml_diff>
--- a/docs/Documentacion_del_Proyecto.docx
+++ b/docs/Documentacion_del_Proyecto.docx
@@ -1958,7 +1958,7 @@
         <w:spacing w:after="200" w:before="500"/>
       </w:pPr>
       <w:r>
-        <w:t xml:space="preserve">5. Captura De Requisitos</w:t>
+        <w:t xml:space="preserve">2. Captura De Requisitos</w:t>
       </w:r>
     </w:p>
     <w:p>
@@ -1967,7 +1967,7 @@
         <w:spacing w:after="150" w:before="300"/>
       </w:pPr>
       <w:r>
-        <w:t xml:space="preserve">5.1 Identificar Actores Y Casos De Uso</w:t>
+        <w:t xml:space="preserve">2.1 Identificar Actores Y Casos De Uso</w:t>
       </w:r>
     </w:p>
     <w:p>
@@ -2044,7 +2044,7 @@
         <w:spacing w:after="150" w:before="300"/>
       </w:pPr>
       <w:r>
-        <w:t xml:space="preserve">5.2 Priorizar Casos De Uso</w:t>
+        <w:t xml:space="preserve">2.2 Priorizar Casos De Uso</w:t>
       </w:r>
     </w:p>
     <w:tbl>
@@ -3359,7 +3359,7 @@
         <w:spacing w:after="150" w:before="300"/>
       </w:pPr>
       <w:r>
-        <w:t xml:space="preserve">5.3 Detallar Caso De Uso</w:t>
+        <w:t xml:space="preserve">2.3 Detallar Caso De Uso</w:t>
       </w:r>
     </w:p>
     <w:p>
@@ -6296,7 +6296,7 @@
         <w:spacing w:after="150" w:before="300"/>
       </w:pPr>
       <w:r>
-        <w:t xml:space="preserve">5.4 Estructurar Modelo De Caso De Uso</w:t>
+        <w:t xml:space="preserve">2.4 Estructurar Modelo De Caso De Uso</w:t>
       </w:r>
     </w:p>
     <w:p>
@@ -6375,7 +6375,7 @@
         <w:spacing w:after="200" w:before="500"/>
       </w:pPr>
       <w:r>
-        <w:t xml:space="preserve">6. Análisis</w:t>
+        <w:t xml:space="preserve">3. Análisis</w:t>
       </w:r>
     </w:p>
     <w:p>
@@ -6384,7 +6384,7 @@
         <w:spacing w:after="150" w:before="300"/>
       </w:pPr>
       <w:r>
-        <w:t xml:space="preserve">6.1 Análisis De Arquitectura</w:t>
+        <w:t xml:space="preserve">3.1 Análisis De Arquitectura</w:t>
       </w:r>
     </w:p>
     <w:p>
@@ -6393,7 +6393,7 @@
         <w:spacing w:after="120" w:before="220"/>
       </w:pPr>
       <w:r>
-        <w:t xml:space="preserve">6.1.1 Identificar Paquetes</w:t>
+        <w:t xml:space="preserve">3.1.1 Identificar Paquetes</w:t>
       </w:r>
     </w:p>
     <w:p>
@@ -6472,7 +6472,7 @@
         <w:spacing w:after="150" w:before="300"/>
       </w:pPr>
       <w:r>
-        <w:t xml:space="preserve">6.2. Análisis de caso de uso — Diagramas de Comunicación</w:t>
+        <w:t xml:space="preserve">3.2. Análisis de caso de uso — Diagramas de Comunicación</w:t>
       </w:r>
     </w:p>
     <w:p>
@@ -7401,7 +7401,7 @@
         <w:spacing w:after="150" w:before="300"/>
       </w:pPr>
       <w:r>
-        <w:t xml:space="preserve">6.3. Análisis de clase</w:t>
+        <w:t xml:space="preserve">3.3. Análisis de clase</w:t>
       </w:r>
     </w:p>
     <w:p>
@@ -7480,7 +7480,7 @@
         <w:spacing w:after="150" w:before="300"/>
       </w:pPr>
       <w:r>
-        <w:t xml:space="preserve">6.4. Análisis de paquete</w:t>
+        <w:t xml:space="preserve">3.4. Análisis de paquete</w:t>
       </w:r>
     </w:p>
     <w:p>
@@ -7497,7 +7497,7 @@
         <w:spacing w:after="200" w:before="500"/>
       </w:pPr>
       <w:r>
-        <w:t xml:space="preserve">7. Diseño</w:t>
+        <w:t xml:space="preserve">4. Diseño</w:t>
       </w:r>
     </w:p>
     <w:p>
@@ -7506,7 +7506,7 @@
         <w:spacing w:after="150" w:before="300"/>
       </w:pPr>
       <w:r>
-        <w:t xml:space="preserve">7.1 Diseño de arquitectura</w:t>
+        <w:t xml:space="preserve">4.1 Diseño de arquitectura</w:t>
       </w:r>
     </w:p>
     <w:p>
@@ -7515,7 +7515,7 @@
         <w:spacing w:after="120" w:before="220"/>
       </w:pPr>
       <w:r>
-        <w:t xml:space="preserve">7.1.1 Diseño físico de arquitectura (Diagrama de Despliegue)</w:t>
+        <w:t xml:space="preserve">4.1.1 Diseño físico de arquitectura (Diagrama de Despliegue)</w:t>
       </w:r>
     </w:p>
     <w:p>
@@ -7594,7 +7594,7 @@
         <w:spacing w:after="120" w:before="220"/>
       </w:pPr>
       <w:r>
-        <w:t xml:space="preserve">7.1.2 Diseño lógico de arquitectura</w:t>
+        <w:t xml:space="preserve">4.1.2 Diseño lógico de arquitectura</w:t>
       </w:r>
     </w:p>
     <w:p>
@@ -7611,7 +7611,7 @@
         <w:spacing w:after="150" w:before="300"/>
       </w:pPr>
       <w:r>
-        <w:t xml:space="preserve">7.2 Diseño de datos lógicos</w:t>
+        <w:t xml:space="preserve">4.2 Diseño de datos lógicos</w:t>
       </w:r>
     </w:p>
     <w:p>
@@ -7656,7 +7656,7 @@
         <w:spacing w:after="150" w:before="300"/>
       </w:pPr>
       <w:r>
-        <w:t xml:space="preserve">7.3 Diseño de casos de uso</w:t>
+        <w:t xml:space="preserve">4.3 Diseño de casos de uso</w:t>
       </w:r>
     </w:p>
     <w:p>
@@ -7665,7 +7665,7 @@
         <w:spacing w:after="120" w:before="220"/>
       </w:pPr>
       <w:r>
-        <w:t xml:space="preserve">7.3.1 Diagrama de secuencia</w:t>
+        <w:t xml:space="preserve">4.3.1 Diagrama de secuencia</w:t>
       </w:r>
     </w:p>
     <w:p>
@@ -8594,7 +8594,7 @@
         <w:spacing w:after="200" w:before="500"/>
       </w:pPr>
       <w:r>
-        <w:t xml:space="preserve">8. Implementación</w:t>
+        <w:t xml:space="preserve">5. Implementación</w:t>
       </w:r>
     </w:p>
     <w:p>
@@ -8603,7 +8603,7 @@
         <w:spacing w:after="150" w:before="300"/>
       </w:pPr>
       <w:r>
-        <w:t xml:space="preserve">8.1 Implementación de la arquitectura del sistema</w:t>
+        <w:t xml:space="preserve">5.1 Implementación de la arquitectura del sistema</w:t>
       </w:r>
     </w:p>
     <w:p>
@@ -8660,7 +8660,7 @@
         <w:spacing w:after="150" w:before="300"/>
       </w:pPr>
       <w:r>
-        <w:t xml:space="preserve">8.2 Implementación de la arquitectura de subsistema</w:t>
+        <w:t xml:space="preserve">5.2 Implementación de la arquitectura de subsistema</w:t>
       </w:r>
     </w:p>
     <w:p>
@@ -8729,6 +8729,480 @@
       </w:pPr>
       <w:r>
         <w:t xml:space="preserve">El backend invoca directamente el SDK de Google Gemini (sin microservicio intermedio) con instrucciones de sistema distintas según la tarea: una para el chat conversacional enjaulado a ingeniería de software, y otra para la interpretación de imágenes que enseña al modelo a leer la notación UML dibujada a mano y a devolver JSON estructurado.</w:t>
+      </w:r>
+    </w:p>
+    <w:p>
+      <w:pPr>
+        <w:pStyle w:val="Heading1"/>
+        <w:spacing w:after="200" w:before="500"/>
+      </w:pPr>
+      <w:r>
+        <w:t xml:space="preserve">6. Pruebas</w:t>
+      </w:r>
+    </w:p>
+    <w:p>
+      <w:r>
+        <w:t xml:space="preserve">Esta fase valida que la implementación cumpla los requisitos definidos en el Perfil y el Modelo de Casos de Uso. A diferencia del resto de este documento, aquí no se describe lo que el sistema debería hacer, sino la evidencia concreta de que se verificó que lo hace.</w:t>
+      </w:r>
+    </w:p>
+    <w:p>
+      <w:pPr>
+        <w:pStyle w:val="Heading2"/>
+        <w:spacing w:after="150" w:before="300"/>
+      </w:pPr>
+      <w:r>
+        <w:t xml:space="preserve">6.1 Plan de pruebas</w:t>
+      </w:r>
+    </w:p>
+    <w:p>
+      <w:pPr>
+        <w:pStyle w:val="ListParagraph"/>
+        <w:numPr>
+          <w:ilvl w:val="0"/>
+          <w:numId w:val="2"/>
+        </w:numPr>
+        <w:spacing w:after="100"/>
+      </w:pPr>
+      <w:r>
+        <w:rPr>
+          <w:b/>
+          <w:bCs/>
+        </w:rPr>
+        <w:t xml:space="preserve">Alcance:</w:t>
+      </w:r>
+      <w:r>
+        <w:t xml:space="preserve"> pruebas unitarias sobre la lógica pura del backend (el algoritmo de diff de la bitácora), pruebas funcionales del backend generado (Spring Boot) con Postman, y pruebas de integración y de sistema ejecutadas en vivo contra los servicios reales (PostgreSQL, Amazon S3, Google Gemini) y, para el sistema completo, contra el servidor de producción real en AWS (http://34.231.176.225), no contra localhost.</w:t>
+      </w:r>
+    </w:p>
+    <w:p>
+      <w:pPr>
+        <w:pStyle w:val="ListParagraph"/>
+        <w:numPr>
+          <w:ilvl w:val="0"/>
+          <w:numId w:val="2"/>
+        </w:numPr>
+        <w:spacing w:after="100"/>
+      </w:pPr>
+      <w:r>
+        <w:rPr>
+          <w:b/>
+          <w:bCs/>
+        </w:rPr>
+        <w:t xml:space="preserve">Estrategia:</w:t>
+      </w:r>
+      <w:r>
+        <w:t xml:space="preserve"> caja blanca (Vitest) para la lógica de negocio aislable, y caja negra (peticiones HTTP reales vía curl/Postman y verificación desde el navegador) para los endpoints REST, los WebSockets y el flujo end-to-end del usuario.</w:t>
+      </w:r>
+    </w:p>
+    <w:p>
+      <w:pPr>
+        <w:pStyle w:val="ListParagraph"/>
+        <w:numPr>
+          <w:ilvl w:val="0"/>
+          <w:numId w:val="2"/>
+        </w:numPr>
+        <w:spacing w:after="100"/>
+      </w:pPr>
+      <w:r>
+        <w:rPr>
+          <w:b/>
+          <w:bCs/>
+        </w:rPr>
+        <w:t xml:space="preserve">Criterios de aceptación:</w:t>
+      </w:r>
+      <w:r>
+        <w:t xml:space="preserve"> el código Spring Boot generado debe compilar y ejecutarse sin modificaciones; cada endpoint debe responder con el código HTTP y el cuerpo esperado; un archivo subido a S3 debe descargarse con el mismo contenido byte a byte que el original.</w:t>
+      </w:r>
+    </w:p>
+    <w:p>
+      <w:pPr>
+        <w:pStyle w:val="Heading2"/>
+        <w:spacing w:after="150" w:before="300"/>
+      </w:pPr>
+      <w:r>
+        <w:t xml:space="preserve">6.2 Diseño de pruebas (casos de prueba)</w:t>
+      </w:r>
+    </w:p>
+    <w:p>
+      <w:pPr>
+        <w:pStyle w:val="ListParagraph"/>
+        <w:numPr>
+          <w:ilvl w:val="0"/>
+          <w:numId w:val="2"/>
+        </w:numPr>
+        <w:spacing w:after="100"/>
+      </w:pPr>
+      <w:r>
+        <w:rPr>
+          <w:b/>
+          <w:bCs/>
+        </w:rPr>
+        <w:t xml:space="preserve">CP-01 — Generación de backend Spring Boot:</w:t>
+      </w:r>
+      <w:r>
+        <w:t xml:space="preserve"> a partir de un diagrama con relaciones 1:1, 1:N y N:N, el backend generado debe incluir las cuatro capas (Entity, Repository, Service, Controller) por clase, con las anotaciones JPA correctas (@OneToMany/@ManyToOne, tabla intermedia para N:N).</w:t>
+      </w:r>
+    </w:p>
+    <w:p>
+      <w:pPr>
+        <w:pStyle w:val="ListParagraph"/>
+        <w:numPr>
+          <w:ilvl w:val="0"/>
+          <w:numId w:val="2"/>
+        </w:numPr>
+        <w:spacing w:after="100"/>
+      </w:pPr>
+      <w:r>
+        <w:rPr>
+          <w:b/>
+          <w:bCs/>
+        </w:rPr>
+        <w:t xml:space="preserve">CP-02 — Autenticación y bitácora:</w:t>
+      </w:r>
+      <w:r>
+        <w:t xml:space="preserve"> registrar un usuario, iniciar sesión, crear y modificar un diagrama, y verificar que la bitácora registre el nombre real del usuario autenticado y un resumen legible del cambio (clases agregadas, atributos modificados, relaciones eliminadas).</w:t>
+      </w:r>
+    </w:p>
+    <w:p>
+      <w:pPr>
+        <w:pStyle w:val="ListParagraph"/>
+        <w:numPr>
+          <w:ilvl w:val="0"/>
+          <w:numId w:val="2"/>
+        </w:numPr>
+        <w:spacing w:after="100"/>
+      </w:pPr>
+      <w:r>
+        <w:rPr>
+          <w:b/>
+          <w:bCs/>
+        </w:rPr>
+        <w:t xml:space="preserve">CP-03 — Adjuntos en S3:</w:t>
+      </w:r>
+      <w:r>
+        <w:t xml:space="preserve"> subir un archivo permitido y verificar que aparece en el listado del diagrama, descargarlo mediante la URL firmada y comparar el contenido con el original, eliminarlo y confirmar que desaparece del bucket, e intentar subir un archivo de tipo no permitido (.exe) y verificar el rechazo.</w:t>
+      </w:r>
+    </w:p>
+    <w:p>
+      <w:pPr>
+        <w:pStyle w:val="ListParagraph"/>
+        <w:numPr>
+          <w:ilvl w:val="0"/>
+          <w:numId w:val="2"/>
+        </w:numPr>
+        <w:spacing w:after="100"/>
+      </w:pPr>
+      <w:r>
+        <w:rPr>
+          <w:b/>
+          <w:bCs/>
+        </w:rPr>
+        <w:t xml:space="preserve">CP-04 — Colaboración en tiempo real:</w:t>
+      </w:r>
+      <w:r>
+        <w:t xml:space="preserve"> con dos sesiones de navegador abiertas sobre el mismo diagrama, verificar que un cambio hecho en una se refleje en la otra vía WebSocket sin recargar la página.</w:t>
+      </w:r>
+    </w:p>
+    <w:p>
+      <w:pPr>
+        <w:pStyle w:val="ListParagraph"/>
+        <w:numPr>
+          <w:ilvl w:val="0"/>
+          <w:numId w:val="2"/>
+        </w:numPr>
+        <w:spacing w:after="100"/>
+      </w:pPr>
+      <w:r>
+        <w:rPr>
+          <w:b/>
+          <w:bCs/>
+        </w:rPr>
+        <w:t xml:space="preserve">Componente de prueba:</w:t>
+      </w:r>
+      <w:r>
+        <w:t xml:space="preserve"> la suite model-diff.util.spec.ts (Vitest) ejercita la función pura summarizeModelDiff con 7 casos — clase agregada, eliminada, renombrada, atributos y operaciones modificados, y relaciones agregadas/eliminadas/con tipo cambiado — sin depender de base de datos ni red.</w:t>
+      </w:r>
+    </w:p>
+    <w:p>
+      <w:pPr>
+        <w:pStyle w:val="Heading2"/>
+        <w:spacing w:after="150" w:before="300"/>
+      </w:pPr>
+      <w:r>
+        <w:t xml:space="preserve">6.3 Pruebas de integración</w:t>
+      </w:r>
+    </w:p>
+    <w:p>
+      <w:pPr>
+        <w:pStyle w:val="ListParagraph"/>
+        <w:numPr>
+          <w:ilvl w:val="0"/>
+          <w:numId w:val="2"/>
+        </w:numPr>
+        <w:spacing w:after="100"/>
+      </w:pPr>
+      <w:r>
+        <w:rPr>
+          <w:b/>
+          <w:bCs/>
+        </w:rPr>
+        <w:t xml:space="preserve">Frontend ↔ Backend (vía Nginx):</w:t>
+      </w:r>
+      <w:r>
+        <w:t xml:space="preserve"> en producción, Nginx actúa como proxy reverso hacia NestJS para /auth, /diagrams, /attachments, /generator, /ai y /socket.io. Se verificó cada ruta con peticiones reales contra la IP pública.</w:t>
+      </w:r>
+    </w:p>
+    <w:p>
+      <w:pPr>
+        <w:pStyle w:val="ListParagraph"/>
+        <w:numPr>
+          <w:ilvl w:val="0"/>
+          <w:numId w:val="2"/>
+        </w:numPr>
+        <w:spacing w:after="100"/>
+      </w:pPr>
+      <w:r>
+        <w:rPr>
+          <w:b/>
+          <w:bCs/>
+        </w:rPr>
+        <w:t xml:space="preserve">Backend ↔ PostgreSQL:</w:t>
+      </w:r>
+      <w:r>
+        <w:t xml:space="preserve"> persistencia de diagramas, relaciones y entradas de la bitácora, con DB_SYNCHRONIZE=true generando el esquema automáticamente al iniciar el contenedor.</w:t>
+      </w:r>
+    </w:p>
+    <w:p>
+      <w:pPr>
+        <w:pStyle w:val="ListParagraph"/>
+        <w:numPr>
+          <w:ilvl w:val="0"/>
+          <w:numId w:val="2"/>
+        </w:numPr>
+        <w:spacing w:after="100"/>
+      </w:pPr>
+      <w:r>
+        <w:rPr>
+          <w:b/>
+          <w:bCs/>
+        </w:rPr>
+        <w:t xml:space="preserve">Backend ↔ Amazon S3:</w:t>
+      </w:r>
+      <w:r>
+        <w:t xml:space="preserve"> subida, descarga con URL firmada (expira en 5 minutos) y eliminación, verificadas contra el bucket real diagramador-uml-adjuntos-fernando, no contra un mock.</w:t>
+      </w:r>
+    </w:p>
+    <w:p>
+      <w:pPr>
+        <w:pStyle w:val="ListParagraph"/>
+        <w:numPr>
+          <w:ilvl w:val="0"/>
+          <w:numId w:val="2"/>
+        </w:numPr>
+        <w:spacing w:after="100"/>
+      </w:pPr>
+      <w:r>
+        <w:rPr>
+          <w:b/>
+          <w:bCs/>
+        </w:rPr>
+        <w:t xml:space="preserve">Backend ↔ Google Gemini:</w:t>
+      </w:r>
+      <w:r>
+        <w:t xml:space="preserve"> el chat conversacional, el dictado por voz y la interpretación de fotografías de diagramas dibujados a mano se probaron contra el servicio real de IA, no contra una respuesta simulada.</w:t>
+      </w:r>
+    </w:p>
+    <w:p>
+      <w:r>
+        <w:t xml:space="preserve">Defectos encontrados y corregidos durante la integración (antes del primer despliegue a producción, gracias a un ensayo local completo con Docker Compose sobre la misma imagen que se desplegaría):</w:t>
+      </w:r>
+    </w:p>
+    <w:p>
+      <w:pPr>
+        <w:pStyle w:val="ListParagraph"/>
+        <w:numPr>
+          <w:ilvl w:val="0"/>
+          <w:numId w:val="2"/>
+        </w:numPr>
+        <w:spacing w:after="100"/>
+      </w:pPr>
+      <w:r>
+        <w:rPr>
+          <w:b/>
+          <w:bCs/>
+        </w:rPr>
+        <w:t xml:space="preserve">Rutas de Nginx incompletas:</w:t>
+      </w:r>
+      <w:r>
+        <w:t xml:space="preserve"> nginx.conf no reenviaba /auth ni /attachments al backend — se habían agregado esos módulos después de escribir la configuración original. Sin el fix, login y adjuntos habrían devuelto el HTML de la SPA en vez de JSON en producción, aunque funcionaran en desarrollo.</w:t>
+      </w:r>
+    </w:p>
+    <w:p>
+      <w:pPr>
+        <w:pStyle w:val="ListParagraph"/>
+        <w:numPr>
+          <w:ilvl w:val="0"/>
+          <w:numId w:val="2"/>
+        </w:numPr>
+        <w:spacing w:after="100"/>
+      </w:pPr>
+      <w:r>
+        <w:rPr>
+          <w:b/>
+          <w:bCs/>
+        </w:rPr>
+        <w:t xml:space="preserve">Incompatibilidad de versión de Node/npm en el build:</w:t>
+      </w:r>
+      <w:r>
+        <w:t xml:space="preserve"> node:22-alpine (npm 10.x) resolvía package-lock.json de forma distinta al npm 11.x local, y npm ci fallaba dentro del contenedor con “Missing: typescript@5.9.3 from lock file”. Se corrigió alineando ambos Dockerfiles a node:24-alpine.</w:t>
+      </w:r>
+    </w:p>
+    <w:p>
+      <w:pPr>
+        <w:pStyle w:val="ListParagraph"/>
+        <w:numPr>
+          <w:ilvl w:val="0"/>
+          <w:numId w:val="2"/>
+        </w:numPr>
+        <w:spacing w:after="100"/>
+      </w:pPr>
+      <w:r>
+        <w:rPr>
+          <w:b/>
+          <w:bCs/>
+        </w:rPr>
+        <w:t xml:space="preserve">Variables de entorno incompletas en Docker Compose:</w:t>
+      </w:r>
+      <w:r>
+        <w:t xml:space="preserve"> docker-compose.prod.yml no exponía JWT_SECRET ni las variables AWS_* al contenedor del backend — se agregaron esas variables después de escribir el archivo original.</w:t>
+      </w:r>
+    </w:p>
+    <w:p>
+      <w:pPr>
+        <w:pStyle w:val="Heading2"/>
+        <w:spacing w:after="150" w:before="300"/>
+      </w:pPr>
+      <w:r>
+        <w:t xml:space="preserve">6.4 Pruebas de sistema</w:t>
+      </w:r>
+    </w:p>
+    <w:p>
+      <w:r>
+        <w:t xml:space="preserve">Se ejecutó el flujo completo extremo a extremo contra el servidor de producción real (http://34.231.176.225), no contra un entorno local:</w:t>
+      </w:r>
+    </w:p>
+    <w:p>
+      <w:pPr>
+        <w:pStyle w:val="ListParagraph"/>
+        <w:numPr>
+          <w:ilvl w:val="0"/>
+          <w:numId w:val="2"/>
+        </w:numPr>
+        <w:spacing w:after="100"/>
+      </w:pPr>
+      <w:r>
+        <w:rPr>
+          <w:b/>
+          <w:bCs/>
+        </w:rPr>
+        <w:t xml:space="preserve">SYS-01 — Registro, autenticación y creación de diagrama:</w:t>
+      </w:r>
+      <w:r>
+        <w:t xml:space="preserve"> un usuario nuevo se registra, inicia sesión, crea un diagrama y agrega clases — resultado: correcto.</w:t>
+      </w:r>
+    </w:p>
+    <w:p>
+      <w:pPr>
+        <w:pStyle w:val="ListParagraph"/>
+        <w:numPr>
+          <w:ilvl w:val="0"/>
+          <w:numId w:val="2"/>
+        </w:numPr>
+        <w:spacing w:after="100"/>
+      </w:pPr>
+      <w:r>
+        <w:rPr>
+          <w:b/>
+          <w:bCs/>
+        </w:rPr>
+        <w:t xml:space="preserve">SYS-02 — Bitácora de cambios:</w:t>
+      </w:r>
+      <w:r>
+        <w:t xml:space="preserve"> cada modificación queda registrada con el nombre real del usuario y un resumen del cambio — resultado: correcto.</w:t>
+      </w:r>
+    </w:p>
+    <w:p>
+      <w:pPr>
+        <w:pStyle w:val="ListParagraph"/>
+        <w:numPr>
+          <w:ilvl w:val="0"/>
+          <w:numId w:val="2"/>
+        </w:numPr>
+        <w:spacing w:after="100"/>
+      </w:pPr>
+      <w:r>
+        <w:rPr>
+          <w:b/>
+          <w:bCs/>
+        </w:rPr>
+        <w:t xml:space="preserve">SYS-03 — Documentos adjuntos:</w:t>
+      </w:r>
+      <w:r>
+        <w:t xml:space="preserve"> subida a S3 real desde dentro de la infraestructura de AWS — resultado: correcto.</w:t>
+      </w:r>
+    </w:p>
+    <w:p>
+      <w:pPr>
+        <w:pStyle w:val="ListParagraph"/>
+        <w:numPr>
+          <w:ilvl w:val="0"/>
+          <w:numId w:val="2"/>
+        </w:numPr>
+        <w:spacing w:after="100"/>
+      </w:pPr>
+      <w:r>
+        <w:rPr>
+          <w:b/>
+          <w:bCs/>
+        </w:rPr>
+        <w:t xml:space="preserve">SYS-04 — Generación de backend Spring Boot:</w:t>
+      </w:r>
+      <w:r>
+        <w:t xml:space="preserve"> descarga del proyecto generado, revisión de las cuatro capas por clase — resultado: correcto.</w:t>
+      </w:r>
+    </w:p>
+    <w:p>
+      <w:pPr>
+        <w:pStyle w:val="ListParagraph"/>
+        <w:numPr>
+          <w:ilvl w:val="0"/>
+          <w:numId w:val="2"/>
+        </w:numPr>
+        <w:spacing w:after="100"/>
+      </w:pPr>
+      <w:r>
+        <w:rPr>
+          <w:b/>
+          <w:bCs/>
+        </w:rPr>
+        <w:t xml:space="preserve">SYS-05 — Recuperación ante reinicio del servidor:</w:t>
+      </w:r>
+      <w:r>
+        <w:t xml:space="preserve"> los tres contenedores (restart: unless-stopped, Docker habilitado al arranque) vuelven a levantarse automáticamente tras un reinicio de la instancia EC2, sin intervención manual.</w:t>
+      </w:r>
+    </w:p>
+    <w:p>
+      <w:pPr>
+        <w:pStyle w:val="Heading2"/>
+        <w:spacing w:after="150" w:before="300"/>
+      </w:pPr>
+      <w:r>
+        <w:t xml:space="preserve">6.5 Evaluación de las pruebas</w:t>
+      </w:r>
+    </w:p>
+    <w:p>
+      <w:r>
+        <w:t xml:space="preserve">Todos los casos de prueba diseñados en 6.2 se ejecutaron y pasaron. Los tres defectos encontrados durante la integración (6.3) se detectaron antes de tocar la infraestructura de AWS —gracias a ensayar primero la pila completa de Docker Compose en local— y se corrigieron y verificaron antes del primer despliegue real, por lo que ninguno llegó a afectar al sistema en producción. Se considera que el sistema cumple los criterios de aceptación definidos en el plan de pruebas y está listo para la fase de despliegue documentada en la Parte I, sección 3.</w:t>
       </w:r>
     </w:p>
     <w:p>

</xml_diff>

<commit_message>
Elimina toda referencia a Scrum de la documentacion, deja solo PUDS
Quita el capitulo completo "PARTE 4 - Gestion agil del proyecto con
Scrum" (roles, product backlog, sprints, ceremonias), reescribe el
parrafo de cierre de la seccion de teoria del PUDS que remitia a esa
parte, y quita "Scrum" de la lista de ejemplos de metodologias agiles
en la teoria (queda Kanban/XP). El documento ahora describe el proceso
de desarrollo exclusivamente en terminos de PUDS.

Co-Authored-By: Claude Sonnet 5 <noreply@anthropic.com>
</commit_message>
<xml_diff>
--- a/docs/Documentacion_del_Proyecto.docx
+++ b/docs/Documentacion_del_Proyecto.docx
@@ -1585,7 +1585,7 @@
           <w:b/>
           <w:bCs/>
         </w:rPr>
-        <w:t xml:space="preserve">Metodologías ágiles (Scrum, Kanban):</w:t>
+        <w:t xml:space="preserve">Metodologías ágiles (Kanban, XP):</w:t>
       </w:r>
       <w:r>
         <w:t xml:space="preserve"> promueven iteraciones cortas, entregas incrementales verificables y adaptación continua a cambios de requisitos.</w:t>
@@ -1633,7 +1633,7 @@
     </w:p>
     <w:p>
       <w:r>
-        <w:t xml:space="preserve">La Parte 2 de este documento desarrolla en detalle cómo se recorrieron las fases de análisis, diseño e implementación para este proyecto. Ese recorrido se complementó, además, con un enfoque ágil real de gestión por sprints (ver Parte 4 — Gestión ágil del proyecto con Scrum), de modo que las fases del PUDS no se ejecutaron una sola vez de forma lineal, sino de manera incremental a lo largo de varios ciclos cortos de entrega.</w:t>
+        <w:t xml:space="preserve">La Parte 2 de este documento desarrolla en detalle cómo se recorrieron las fases de análisis, diseño e implementación para este proyecto, siguiendo el marco de fases del PUDS de manera incremental a lo largo de varios ciclos de trabajo, en lugar de ejecutarlas una sola vez de forma estrictamente lineal.</w:t>
       </w:r>
     </w:p>
     <w:p>
@@ -9595,1454 +9595,6 @@
       </w:pPr>
       <w:r>
         <w:t xml:space="preserve">Una vez generado y desplegado el backend, el usuario final lo conecta a una aplicación móvil desarrollada en Flutter. El proyecto incluye una plantilla reutilizable (flutter-template) con un cliente REST genérico cuyo endpoint y esquema de datos se configuran en tiempo de ejecución —sin recompilar la app—, pensada para conectar en minutos cualquier backend generado por la herramienta durante una demostración en vivo.</w:t>
-      </w:r>
-    </w:p>
-    <w:p>
-      <w:pPr>
-        <w:pageBreakBefore/>
-        <w:pBdr>
-          <w:bottom w:val="single" w:color="1F4E79" w:sz="8" w:space="4"/>
-        </w:pBdr>
-        <w:spacing w:after="200" w:before="700"/>
-      </w:pPr>
-      <w:r>
-        <w:rPr>
-          <w:b/>
-          <w:bCs/>
-          <w:color w:val="1F4E79"/>
-          <w:sz w:val="30"/>
-          <w:szCs w:val="30"/>
-        </w:rPr>
-        <w:t xml:space="preserve">PARTE 4 — Gestión ágil del proyecto con Scrum</w:t>
-      </w:r>
-    </w:p>
-    <w:p>
-      <w:pPr>
-        <w:pStyle w:val="Heading2"/>
-        <w:spacing w:after="150" w:before="300"/>
-      </w:pPr>
-      <w:r>
-        <w:t xml:space="preserve">4.1 Roles y marco de trabajo</w:t>
-      </w:r>
-    </w:p>
-    <w:p>
-      <w:r>
-        <w:t xml:space="preserve">El desarrollo se organizó bajo un marco ágil inspirado en Scrum, adaptado al contexto de un proyecto académico individual con asistencia de un agente de IA (Claude Code) como compañero de programación (pair programming). Los roles se distribuyeron así:</w:t>
-      </w:r>
-    </w:p>
-    <w:p>
-      <w:pPr>
-        <w:pStyle w:val="ListParagraph"/>
-        <w:numPr>
-          <w:ilvl w:val="0"/>
-          <w:numId w:val="2"/>
-        </w:numPr>
-        <w:spacing w:after="100"/>
-      </w:pPr>
-      <w:r>
-        <w:rPr>
-          <w:b/>
-          <w:bCs/>
-        </w:rPr>
-        <w:t xml:space="preserve">Product Owner:</w:t>
-      </w:r>
-      <w:r>
-        <w:t xml:space="preserve"> el docente/cliente del curso, que definió y fue ajustando los requisitos del examen a lo largo del semestre (herramienta colaborativa, IA más allá de un chatbot simple, generación de backend, interoperabilidad XMI, frontend móvil con voz y modo offline).</w:t>
-      </w:r>
-    </w:p>
-    <w:p>
-      <w:pPr>
-        <w:pStyle w:val="ListParagraph"/>
-        <w:numPr>
-          <w:ilvl w:val="0"/>
-          <w:numId w:val="2"/>
-        </w:numPr>
-        <w:spacing w:after="100"/>
-      </w:pPr>
-      <w:r>
-        <w:rPr>
-          <w:b/>
-          <w:bCs/>
-        </w:rPr>
-        <w:t xml:space="preserve">Scrum Master y Development Team:</w:t>
-      </w:r>
-      <w:r>
-        <w:t xml:space="preserve"> el estudiante, apoyado por un agente de IA para la implementación, las pruebas y la verificación en vivo de cada incremento antes de darlo por terminado.</w:t>
-      </w:r>
-    </w:p>
-    <w:p>
-      <w:pPr>
-        <w:pStyle w:val="Heading2"/>
-        <w:spacing w:after="150" w:before="300"/>
-      </w:pPr>
-      <w:r>
-        <w:t xml:space="preserve">4.2 Product Backlog</w:t>
-      </w:r>
-    </w:p>
-    <w:p>
-      <w:r>
-        <w:t xml:space="preserve">El backlog se construyó de forma incremental: cada historia de usuario nació de un requisito explícito del Product Owner o de una funcionalidad observada en herramientas CASE de referencia (Enterprise Architect, Lucidchart, draw.io) durante el análisis competitivo. La tabla siguiente resume las historias de usuario que componen el backlog y su estado actual.</w:t>
-      </w:r>
-    </w:p>
-    <w:tbl>
-      <w:tblPr>
-        <w:tblW w:type="dxa" w:w="9100"/>
-        <w:tblBorders>
-          <w:top w:val="single" w:color="auto" w:sz="4"/>
-          <w:left w:val="single" w:color="auto" w:sz="4"/>
-          <w:bottom w:val="single" w:color="auto" w:sz="4"/>
-          <w:right w:val="single" w:color="auto" w:sz="4"/>
-          <w:insideH w:val="single" w:color="auto" w:sz="4"/>
-          <w:insideV w:val="single" w:color="auto" w:sz="4"/>
-        </w:tblBorders>
-      </w:tblPr>
-      <w:tblGrid>
-        <w:gridCol w:w="700"/>
-        <w:gridCol w:w="5200"/>
-        <w:gridCol w:w="1400"/>
-        <w:gridCol w:w="1800"/>
-      </w:tblGrid>
-      <w:tr>
-        <w:tc>
-          <w:tcPr>
-            <w:tcW w:type="dxa" w:w="700"/>
-            <w:shd w:fill="D9D9D9" w:val="clear"/>
-          </w:tcPr>
-          <w:p>
-            <w:r>
-              <w:rPr>
-                <w:b/>
-                <w:bCs/>
-                <w:sz w:val="18"/>
-                <w:szCs w:val="18"/>
-              </w:rPr>
-              <w:t xml:space="preserve">ID</w:t>
-            </w:r>
-          </w:p>
-        </w:tc>
-        <w:tc>
-          <w:tcPr>
-            <w:tcW w:type="dxa" w:w="5200"/>
-            <w:shd w:fill="D9D9D9" w:val="clear"/>
-          </w:tcPr>
-          <w:p>
-            <w:r>
-              <w:rPr>
-                <w:b/>
-                <w:bCs/>
-                <w:sz w:val="18"/>
-                <w:szCs w:val="18"/>
-              </w:rPr>
-              <w:t xml:space="preserve">HISTORIA DE USUARIO</w:t>
-            </w:r>
-          </w:p>
-        </w:tc>
-        <w:tc>
-          <w:tcPr>
-            <w:tcW w:type="dxa" w:w="1400"/>
-            <w:shd w:fill="D9D9D9" w:val="clear"/>
-          </w:tcPr>
-          <w:p>
-            <w:r>
-              <w:rPr>
-                <w:b/>
-                <w:bCs/>
-                <w:sz w:val="18"/>
-                <w:szCs w:val="18"/>
-              </w:rPr>
-              <w:t xml:space="preserve">PRIORIDAD</w:t>
-            </w:r>
-          </w:p>
-        </w:tc>
-        <w:tc>
-          <w:tcPr>
-            <w:tcW w:type="dxa" w:w="1800"/>
-            <w:shd w:fill="D9D9D9" w:val="clear"/>
-          </w:tcPr>
-          <w:p>
-            <w:r>
-              <w:rPr>
-                <w:b/>
-                <w:bCs/>
-                <w:sz w:val="18"/>
-                <w:szCs w:val="18"/>
-              </w:rPr>
-              <w:t xml:space="preserve">ESTADO</w:t>
-            </w:r>
-          </w:p>
-        </w:tc>
-      </w:tr>
-      <w:tr>
-        <w:tc>
-          <w:tcPr>
-            <w:tcW w:type="dxa" w:w="700"/>
-          </w:tcPr>
-          <w:p>
-            <w:r>
-              <w:rPr>
-                <w:b w:val="false"/>
-                <w:bCs w:val="false"/>
-                <w:sz w:val="18"/>
-                <w:szCs w:val="18"/>
-              </w:rPr>
-              <w:t xml:space="preserve">HU1</w:t>
-            </w:r>
-          </w:p>
-        </w:tc>
-        <w:tc>
-          <w:tcPr>
-            <w:tcW w:type="dxa" w:w="5200"/>
-          </w:tcPr>
-          <w:p>
-            <w:r>
-              <w:rPr>
-                <w:b w:val="false"/>
-                <w:bCs w:val="false"/>
-                <w:sz w:val="18"/>
-                <w:szCs w:val="18"/>
-              </w:rPr>
-              <w:t xml:space="preserve">Como usuario quiero crear y editar diagramas de clases UML de forma colaborativa en tiempo real, con bloqueo por clase para evitar sobrescrituras.</w:t>
-            </w:r>
-          </w:p>
-        </w:tc>
-        <w:tc>
-          <w:tcPr>
-            <w:tcW w:type="dxa" w:w="1400"/>
-          </w:tcPr>
-          <w:p>
-            <w:r>
-              <w:rPr>
-                <w:b w:val="false"/>
-                <w:bCs w:val="false"/>
-                <w:sz w:val="18"/>
-                <w:szCs w:val="18"/>
-              </w:rPr>
-              <w:t xml:space="preserve">Alta</w:t>
-            </w:r>
-          </w:p>
-        </w:tc>
-        <w:tc>
-          <w:tcPr>
-            <w:tcW w:type="dxa" w:w="1800"/>
-          </w:tcPr>
-          <w:p>
-            <w:r>
-              <w:rPr>
-                <w:b w:val="false"/>
-                <w:bCs w:val="false"/>
-                <w:sz w:val="18"/>
-                <w:szCs w:val="18"/>
-              </w:rPr>
-              <w:t xml:space="preserve">Completado</w:t>
-            </w:r>
-          </w:p>
-        </w:tc>
-      </w:tr>
-      <w:tr>
-        <w:tc>
-          <w:tcPr>
-            <w:tcW w:type="dxa" w:w="700"/>
-          </w:tcPr>
-          <w:p>
-            <w:r>
-              <w:rPr>
-                <w:b w:val="false"/>
-                <w:bCs w:val="false"/>
-                <w:sz w:val="18"/>
-                <w:szCs w:val="18"/>
-              </w:rPr>
-              <w:t xml:space="preserve">HU2</w:t>
-            </w:r>
-          </w:p>
-        </w:tc>
-        <w:tc>
-          <w:tcPr>
-            <w:tcW w:type="dxa" w:w="5200"/>
-          </w:tcPr>
-          <w:p>
-            <w:r>
-              <w:rPr>
-                <w:b w:val="false"/>
-                <w:bCs w:val="false"/>
-                <w:sz w:val="18"/>
-                <w:szCs w:val="18"/>
-              </w:rPr>
-              <w:t xml:space="preserve">Como usuario quiero que un asistente de IA modifique el diagrama mediante operaciones atómicas (crear clase, agregar atributo, crear relación) en vez de regenerarlo por completo.</w:t>
-            </w:r>
-          </w:p>
-        </w:tc>
-        <w:tc>
-          <w:tcPr>
-            <w:tcW w:type="dxa" w:w="1400"/>
-          </w:tcPr>
-          <w:p>
-            <w:r>
-              <w:rPr>
-                <w:b w:val="false"/>
-                <w:bCs w:val="false"/>
-                <w:sz w:val="18"/>
-                <w:szCs w:val="18"/>
-              </w:rPr>
-              <w:t xml:space="preserve">Alta</w:t>
-            </w:r>
-          </w:p>
-        </w:tc>
-        <w:tc>
-          <w:tcPr>
-            <w:tcW w:type="dxa" w:w="1800"/>
-          </w:tcPr>
-          <w:p>
-            <w:r>
-              <w:rPr>
-                <w:b w:val="false"/>
-                <w:bCs w:val="false"/>
-                <w:sz w:val="18"/>
-                <w:szCs w:val="18"/>
-              </w:rPr>
-              <w:t xml:space="preserve">Completado</w:t>
-            </w:r>
-          </w:p>
-        </w:tc>
-      </w:tr>
-      <w:tr>
-        <w:tc>
-          <w:tcPr>
-            <w:tcW w:type="dxa" w:w="700"/>
-          </w:tcPr>
-          <w:p>
-            <w:r>
-              <w:rPr>
-                <w:b w:val="false"/>
-                <w:bCs w:val="false"/>
-                <w:sz w:val="18"/>
-                <w:szCs w:val="18"/>
-              </w:rPr>
-              <w:t xml:space="preserve">HU3</w:t>
-            </w:r>
-          </w:p>
-        </w:tc>
-        <w:tc>
-          <w:tcPr>
-            <w:tcW w:type="dxa" w:w="5200"/>
-          </w:tcPr>
-          <w:p>
-            <w:r>
-              <w:rPr>
-                <w:b w:val="false"/>
-                <w:bCs w:val="false"/>
-                <w:sz w:val="18"/>
-                <w:szCs w:val="18"/>
-              </w:rPr>
-              <w:t xml:space="preserve">Como usuario quiero generar un backend Spring Boot completo y compilable (4 capas + PostgreSQL) a partir del diagrama.</w:t>
-            </w:r>
-          </w:p>
-        </w:tc>
-        <w:tc>
-          <w:tcPr>
-            <w:tcW w:type="dxa" w:w="1400"/>
-          </w:tcPr>
-          <w:p>
-            <w:r>
-              <w:rPr>
-                <w:b w:val="false"/>
-                <w:bCs w:val="false"/>
-                <w:sz w:val="18"/>
-                <w:szCs w:val="18"/>
-              </w:rPr>
-              <w:t xml:space="preserve">Alta</w:t>
-            </w:r>
-          </w:p>
-        </w:tc>
-        <w:tc>
-          <w:tcPr>
-            <w:tcW w:type="dxa" w:w="1800"/>
-          </w:tcPr>
-          <w:p>
-            <w:r>
-              <w:rPr>
-                <w:b w:val="false"/>
-                <w:bCs w:val="false"/>
-                <w:sz w:val="18"/>
-                <w:szCs w:val="18"/>
-              </w:rPr>
-              <w:t xml:space="preserve">Completado</w:t>
-            </w:r>
-          </w:p>
-        </w:tc>
-      </w:tr>
-      <w:tr>
-        <w:tc>
-          <w:tcPr>
-            <w:tcW w:type="dxa" w:w="700"/>
-          </w:tcPr>
-          <w:p>
-            <w:r>
-              <w:rPr>
-                <w:b w:val="false"/>
-                <w:bCs w:val="false"/>
-                <w:sz w:val="18"/>
-                <w:szCs w:val="18"/>
-              </w:rPr>
-              <w:t xml:space="preserve">HU4</w:t>
-            </w:r>
-          </w:p>
-        </w:tc>
-        <w:tc>
-          <w:tcPr>
-            <w:tcW w:type="dxa" w:w="5200"/>
-          </w:tcPr>
-          <w:p>
-            <w:r>
-              <w:rPr>
-                <w:b w:val="false"/>
-                <w:bCs w:val="false"/>
-                <w:sz w:val="18"/>
-                <w:szCs w:val="18"/>
-              </w:rPr>
-              <w:t xml:space="preserve">Como usuario quiero importar y exportar el modelo en formato XMI 2.1 estándar para interoperar con otras herramientas UML como Enterprise Architect.</w:t>
-            </w:r>
-          </w:p>
-        </w:tc>
-        <w:tc>
-          <w:tcPr>
-            <w:tcW w:type="dxa" w:w="1400"/>
-          </w:tcPr>
-          <w:p>
-            <w:r>
-              <w:rPr>
-                <w:b w:val="false"/>
-                <w:bCs w:val="false"/>
-                <w:sz w:val="18"/>
-                <w:szCs w:val="18"/>
-              </w:rPr>
-              <w:t xml:space="preserve">Alta</w:t>
-            </w:r>
-          </w:p>
-        </w:tc>
-        <w:tc>
-          <w:tcPr>
-            <w:tcW w:type="dxa" w:w="1800"/>
-          </w:tcPr>
-          <w:p>
-            <w:r>
-              <w:rPr>
-                <w:b w:val="false"/>
-                <w:bCs w:val="false"/>
-                <w:sz w:val="18"/>
-                <w:szCs w:val="18"/>
-              </w:rPr>
-              <w:t xml:space="preserve">Completado</w:t>
-            </w:r>
-          </w:p>
-        </w:tc>
-      </w:tr>
-      <w:tr>
-        <w:tc>
-          <w:tcPr>
-            <w:tcW w:type="dxa" w:w="700"/>
-          </w:tcPr>
-          <w:p>
-            <w:r>
-              <w:rPr>
-                <w:b w:val="false"/>
-                <w:bCs w:val="false"/>
-                <w:sz w:val="18"/>
-                <w:szCs w:val="18"/>
-              </w:rPr>
-              <w:t xml:space="preserve">HU5</w:t>
-            </w:r>
-          </w:p>
-        </w:tc>
-        <w:tc>
-          <w:tcPr>
-            <w:tcW w:type="dxa" w:w="5200"/>
-          </w:tcPr>
-          <w:p>
-            <w:r>
-              <w:rPr>
-                <w:b w:val="false"/>
-                <w:bCs w:val="false"/>
-                <w:sz w:val="18"/>
-                <w:szCs w:val="18"/>
-              </w:rPr>
-              <w:t xml:space="preserve">Como usuario quiero iniciar sesión para que el sistema identifique con mi nombre real quién edita cada clase.</w:t>
-            </w:r>
-          </w:p>
-        </w:tc>
-        <w:tc>
-          <w:tcPr>
-            <w:tcW w:type="dxa" w:w="1400"/>
-          </w:tcPr>
-          <w:p>
-            <w:r>
-              <w:rPr>
-                <w:b w:val="false"/>
-                <w:bCs w:val="false"/>
-                <w:sz w:val="18"/>
-                <w:szCs w:val="18"/>
-              </w:rPr>
-              <w:t xml:space="preserve">Media</w:t>
-            </w:r>
-          </w:p>
-        </w:tc>
-        <w:tc>
-          <w:tcPr>
-            <w:tcW w:type="dxa" w:w="1800"/>
-          </w:tcPr>
-          <w:p>
-            <w:r>
-              <w:rPr>
-                <w:b w:val="false"/>
-                <w:bCs w:val="false"/>
-                <w:sz w:val="18"/>
-                <w:szCs w:val="18"/>
-              </w:rPr>
-              <w:t xml:space="preserve">Completado</w:t>
-            </w:r>
-          </w:p>
-        </w:tc>
-      </w:tr>
-      <w:tr>
-        <w:tc>
-          <w:tcPr>
-            <w:tcW w:type="dxa" w:w="700"/>
-          </w:tcPr>
-          <w:p>
-            <w:r>
-              <w:rPr>
-                <w:b w:val="false"/>
-                <w:bCs w:val="false"/>
-                <w:sz w:val="18"/>
-                <w:szCs w:val="18"/>
-              </w:rPr>
-              <w:t xml:space="preserve">HU6</w:t>
-            </w:r>
-          </w:p>
-        </w:tc>
-        <w:tc>
-          <w:tcPr>
-            <w:tcW w:type="dxa" w:w="5200"/>
-          </w:tcPr>
-          <w:p>
-            <w:r>
-              <w:rPr>
-                <w:b w:val="false"/>
-                <w:bCs w:val="false"/>
-                <w:sz w:val="18"/>
-                <w:szCs w:val="18"/>
-              </w:rPr>
-              <w:t xml:space="preserve">Como usuario quiero que las relaciones se dibujen con la notación estándar UML 2.5 (triángulo hueco, rombos, multiplicidad automática) en vez de flechas genéricas.</w:t>
-            </w:r>
-          </w:p>
-        </w:tc>
-        <w:tc>
-          <w:tcPr>
-            <w:tcW w:type="dxa" w:w="1400"/>
-          </w:tcPr>
-          <w:p>
-            <w:r>
-              <w:rPr>
-                <w:b w:val="false"/>
-                <w:bCs w:val="false"/>
-                <w:sz w:val="18"/>
-                <w:szCs w:val="18"/>
-              </w:rPr>
-              <w:t xml:space="preserve">Alta</w:t>
-            </w:r>
-          </w:p>
-        </w:tc>
-        <w:tc>
-          <w:tcPr>
-            <w:tcW w:type="dxa" w:w="1800"/>
-          </w:tcPr>
-          <w:p>
-            <w:r>
-              <w:rPr>
-                <w:b w:val="false"/>
-                <w:bCs w:val="false"/>
-                <w:sz w:val="18"/>
-                <w:szCs w:val="18"/>
-              </w:rPr>
-              <w:t xml:space="preserve">Completado</w:t>
-            </w:r>
-          </w:p>
-        </w:tc>
-      </w:tr>
-      <w:tr>
-        <w:tc>
-          <w:tcPr>
-            <w:tcW w:type="dxa" w:w="700"/>
-          </w:tcPr>
-          <w:p>
-            <w:r>
-              <w:rPr>
-                <w:b w:val="false"/>
-                <w:bCs w:val="false"/>
-                <w:sz w:val="18"/>
-                <w:szCs w:val="18"/>
-              </w:rPr>
-              <w:t xml:space="preserve">HU7</w:t>
-            </w:r>
-          </w:p>
-        </w:tc>
-        <w:tc>
-          <w:tcPr>
-            <w:tcW w:type="dxa" w:w="5200"/>
-          </w:tcPr>
-          <w:p>
-            <w:r>
-              <w:rPr>
-                <w:b w:val="false"/>
-                <w:bCs w:val="false"/>
-                <w:sz w:val="18"/>
-                <w:szCs w:val="18"/>
-              </w:rPr>
-              <w:t xml:space="preserve">Como usuario quiero seleccionar varias clases a la vez y eliminarlas juntas.</w:t>
-            </w:r>
-          </w:p>
-        </w:tc>
-        <w:tc>
-          <w:tcPr>
-            <w:tcW w:type="dxa" w:w="1400"/>
-          </w:tcPr>
-          <w:p>
-            <w:r>
-              <w:rPr>
-                <w:b w:val="false"/>
-                <w:bCs w:val="false"/>
-                <w:sz w:val="18"/>
-                <w:szCs w:val="18"/>
-              </w:rPr>
-              <w:t xml:space="preserve">Media</w:t>
-            </w:r>
-          </w:p>
-        </w:tc>
-        <w:tc>
-          <w:tcPr>
-            <w:tcW w:type="dxa" w:w="1800"/>
-          </w:tcPr>
-          <w:p>
-            <w:r>
-              <w:rPr>
-                <w:b w:val="false"/>
-                <w:bCs w:val="false"/>
-                <w:sz w:val="18"/>
-                <w:szCs w:val="18"/>
-              </w:rPr>
-              <w:t xml:space="preserve">Completado</w:t>
-            </w:r>
-          </w:p>
-        </w:tc>
-      </w:tr>
-      <w:tr>
-        <w:tc>
-          <w:tcPr>
-            <w:tcW w:type="dxa" w:w="700"/>
-          </w:tcPr>
-          <w:p>
-            <w:r>
-              <w:rPr>
-                <w:b w:val="false"/>
-                <w:bCs w:val="false"/>
-                <w:sz w:val="18"/>
-                <w:szCs w:val="18"/>
-              </w:rPr>
-              <w:t xml:space="preserve">HU8</w:t>
-            </w:r>
-          </w:p>
-        </w:tc>
-        <w:tc>
-          <w:tcPr>
-            <w:tcW w:type="dxa" w:w="5200"/>
-          </w:tcPr>
-          <w:p>
-            <w:r>
-              <w:rPr>
-                <w:b w:val="false"/>
-                <w:bCs w:val="false"/>
-                <w:sz w:val="18"/>
-                <w:szCs w:val="18"/>
-              </w:rPr>
-              <w:t xml:space="preserve">Como usuario quiero exportar el diagrama como imagen PNG o SVG para incluirlo en documentación o presentaciones.</w:t>
-            </w:r>
-          </w:p>
-        </w:tc>
-        <w:tc>
-          <w:tcPr>
-            <w:tcW w:type="dxa" w:w="1400"/>
-          </w:tcPr>
-          <w:p>
-            <w:r>
-              <w:rPr>
-                <w:b w:val="false"/>
-                <w:bCs w:val="false"/>
-                <w:sz w:val="18"/>
-                <w:szCs w:val="18"/>
-              </w:rPr>
-              <w:t xml:space="preserve">Baja</w:t>
-            </w:r>
-          </w:p>
-        </w:tc>
-        <w:tc>
-          <w:tcPr>
-            <w:tcW w:type="dxa" w:w="1800"/>
-          </w:tcPr>
-          <w:p>
-            <w:r>
-              <w:rPr>
-                <w:b w:val="false"/>
-                <w:bCs w:val="false"/>
-                <w:sz w:val="18"/>
-                <w:szCs w:val="18"/>
-              </w:rPr>
-              <w:t xml:space="preserve">Completado</w:t>
-            </w:r>
-          </w:p>
-        </w:tc>
-      </w:tr>
-      <w:tr>
-        <w:tc>
-          <w:tcPr>
-            <w:tcW w:type="dxa" w:w="700"/>
-          </w:tcPr>
-          <w:p>
-            <w:r>
-              <w:rPr>
-                <w:b w:val="false"/>
-                <w:bCs w:val="false"/>
-                <w:sz w:val="18"/>
-                <w:szCs w:val="18"/>
-              </w:rPr>
-              <w:t xml:space="preserve">HU9</w:t>
-            </w:r>
-          </w:p>
-        </w:tc>
-        <w:tc>
-          <w:tcPr>
-            <w:tcW w:type="dxa" w:w="5200"/>
-          </w:tcPr>
-          <w:p>
-            <w:r>
-              <w:rPr>
-                <w:b w:val="false"/>
-                <w:bCs w:val="false"/>
-                <w:sz w:val="18"/>
-                <w:szCs w:val="18"/>
-              </w:rPr>
-              <w:t xml:space="preserve">Como usuario quiero declarar clases abstractas e interfaces, reflejadas visualmente y en el código generado.</w:t>
-            </w:r>
-          </w:p>
-        </w:tc>
-        <w:tc>
-          <w:tcPr>
-            <w:tcW w:type="dxa" w:w="1400"/>
-          </w:tcPr>
-          <w:p>
-            <w:r>
-              <w:rPr>
-                <w:b w:val="false"/>
-                <w:bCs w:val="false"/>
-                <w:sz w:val="18"/>
-                <w:szCs w:val="18"/>
-              </w:rPr>
-              <w:t xml:space="preserve">Media</w:t>
-            </w:r>
-          </w:p>
-        </w:tc>
-        <w:tc>
-          <w:tcPr>
-            <w:tcW w:type="dxa" w:w="1800"/>
-          </w:tcPr>
-          <w:p>
-            <w:r>
-              <w:rPr>
-                <w:b w:val="false"/>
-                <w:bCs w:val="false"/>
-                <w:sz w:val="18"/>
-                <w:szCs w:val="18"/>
-              </w:rPr>
-              <w:t xml:space="preserve">Completado</w:t>
-            </w:r>
-          </w:p>
-        </w:tc>
-      </w:tr>
-      <w:tr>
-        <w:tc>
-          <w:tcPr>
-            <w:tcW w:type="dxa" w:w="700"/>
-          </w:tcPr>
-          <w:p>
-            <w:r>
-              <w:rPr>
-                <w:b w:val="false"/>
-                <w:bCs w:val="false"/>
-                <w:sz w:val="18"/>
-                <w:szCs w:val="18"/>
-              </w:rPr>
-              <w:t xml:space="preserve">HU10</w:t>
-            </w:r>
-          </w:p>
-        </w:tc>
-        <w:tc>
-          <w:tcPr>
-            <w:tcW w:type="dxa" w:w="5200"/>
-          </w:tcPr>
-          <w:p>
-            <w:r>
-              <w:rPr>
-                <w:b w:val="false"/>
-                <w:bCs w:val="false"/>
-                <w:sz w:val="18"/>
-                <w:szCs w:val="18"/>
-              </w:rPr>
-              <w:t xml:space="preserve">Como usuario quiero una bitácora que registre quién modificó cada diagrama, qué cambió y cuándo.</w:t>
-            </w:r>
-          </w:p>
-        </w:tc>
-        <w:tc>
-          <w:tcPr>
-            <w:tcW w:type="dxa" w:w="1400"/>
-          </w:tcPr>
-          <w:p>
-            <w:r>
-              <w:rPr>
-                <w:b w:val="false"/>
-                <w:bCs w:val="false"/>
-                <w:sz w:val="18"/>
-                <w:szCs w:val="18"/>
-              </w:rPr>
-              <w:t xml:space="preserve">Media</w:t>
-            </w:r>
-          </w:p>
-        </w:tc>
-        <w:tc>
-          <w:tcPr>
-            <w:tcW w:type="dxa" w:w="1800"/>
-          </w:tcPr>
-          <w:p>
-            <w:r>
-              <w:rPr>
-                <w:b w:val="false"/>
-                <w:bCs w:val="false"/>
-                <w:sz w:val="18"/>
-                <w:szCs w:val="18"/>
-              </w:rPr>
-              <w:t xml:space="preserve">Completado</w:t>
-            </w:r>
-          </w:p>
-        </w:tc>
-      </w:tr>
-      <w:tr>
-        <w:tc>
-          <w:tcPr>
-            <w:tcW w:type="dxa" w:w="700"/>
-          </w:tcPr>
-          <w:p>
-            <w:r>
-              <w:rPr>
-                <w:b w:val="false"/>
-                <w:bCs w:val="false"/>
-                <w:sz w:val="18"/>
-                <w:szCs w:val="18"/>
-              </w:rPr>
-              <w:t xml:space="preserve">HU11</w:t>
-            </w:r>
-          </w:p>
-        </w:tc>
-        <w:tc>
-          <w:tcPr>
-            <w:tcW w:type="dxa" w:w="5200"/>
-          </w:tcPr>
-          <w:p>
-            <w:r>
-              <w:rPr>
-                <w:b w:val="false"/>
-                <w:bCs w:val="false"/>
-                <w:sz w:val="18"/>
-                <w:szCs w:val="18"/>
-              </w:rPr>
-              <w:t xml:space="preserve">Como usuario quiero adjuntar documentos e imágenes a un diagrama, almacenados en la nube (S3).</w:t>
-            </w:r>
-          </w:p>
-        </w:tc>
-        <w:tc>
-          <w:tcPr>
-            <w:tcW w:type="dxa" w:w="1400"/>
-          </w:tcPr>
-          <w:p>
-            <w:r>
-              <w:rPr>
-                <w:b w:val="false"/>
-                <w:bCs w:val="false"/>
-                <w:sz w:val="18"/>
-                <w:szCs w:val="18"/>
-              </w:rPr>
-              <w:t xml:space="preserve">Media</w:t>
-            </w:r>
-          </w:p>
-        </w:tc>
-        <w:tc>
-          <w:tcPr>
-            <w:tcW w:type="dxa" w:w="1800"/>
-          </w:tcPr>
-          <w:p>
-            <w:r>
-              <w:rPr>
-                <w:b w:val="false"/>
-                <w:bCs w:val="false"/>
-                <w:sz w:val="18"/>
-                <w:szCs w:val="18"/>
-              </w:rPr>
-              <w:t xml:space="preserve">Completado</w:t>
-            </w:r>
-          </w:p>
-        </w:tc>
-      </w:tr>
-      <w:tr>
-        <w:tc>
-          <w:tcPr>
-            <w:tcW w:type="dxa" w:w="700"/>
-          </w:tcPr>
-          <w:p>
-            <w:r>
-              <w:rPr>
-                <w:b w:val="false"/>
-                <w:bCs w:val="false"/>
-                <w:sz w:val="18"/>
-                <w:szCs w:val="18"/>
-              </w:rPr>
-              <w:t xml:space="preserve">HU12</w:t>
-            </w:r>
-          </w:p>
-        </w:tc>
-        <w:tc>
-          <w:tcPr>
-            <w:tcW w:type="dxa" w:w="5200"/>
-          </w:tcPr>
-          <w:p>
-            <w:r>
-              <w:rPr>
-                <w:b w:val="false"/>
-                <w:bCs w:val="false"/>
-                <w:sz w:val="18"/>
-                <w:szCs w:val="18"/>
-              </w:rPr>
-              <w:t xml:space="preserve">Como usuario quiero que la aplicación esté desplegada en un servidor accesible públicamente, no solo en un entorno local.</w:t>
-            </w:r>
-          </w:p>
-        </w:tc>
-        <w:tc>
-          <w:tcPr>
-            <w:tcW w:type="dxa" w:w="1400"/>
-          </w:tcPr>
-          <w:p>
-            <w:r>
-              <w:rPr>
-                <w:b w:val="false"/>
-                <w:bCs w:val="false"/>
-                <w:sz w:val="18"/>
-                <w:szCs w:val="18"/>
-              </w:rPr>
-              <w:t xml:space="preserve">Alta</w:t>
-            </w:r>
-          </w:p>
-        </w:tc>
-        <w:tc>
-          <w:tcPr>
-            <w:tcW w:type="dxa" w:w="1800"/>
-          </w:tcPr>
-          <w:p>
-            <w:r>
-              <w:rPr>
-                <w:b w:val="false"/>
-                <w:bCs w:val="false"/>
-                <w:sz w:val="18"/>
-                <w:szCs w:val="18"/>
-              </w:rPr>
-              <w:t xml:space="preserve">Completado</w:t>
-            </w:r>
-          </w:p>
-        </w:tc>
-      </w:tr>
-      <w:tr>
-        <w:tc>
-          <w:tcPr>
-            <w:tcW w:type="dxa" w:w="700"/>
-          </w:tcPr>
-          <w:p>
-            <w:r>
-              <w:rPr>
-                <w:b w:val="false"/>
-                <w:bCs w:val="false"/>
-                <w:sz w:val="18"/>
-                <w:szCs w:val="18"/>
-              </w:rPr>
-              <w:t xml:space="preserve">HU13</w:t>
-            </w:r>
-          </w:p>
-        </w:tc>
-        <w:tc>
-          <w:tcPr>
-            <w:tcW w:type="dxa" w:w="5200"/>
-          </w:tcPr>
-          <w:p>
-            <w:r>
-              <w:rPr>
-                <w:b w:val="false"/>
-                <w:bCs w:val="false"/>
-                <w:sz w:val="18"/>
-                <w:szCs w:val="18"/>
-              </w:rPr>
-              <w:t xml:space="preserve">Como usuario de la app móvil quiero interactuar por voz y seguir trabajando sin conexión, con un asistente de IA que corre en el propio dispositivo.</w:t>
-            </w:r>
-          </w:p>
-        </w:tc>
-        <w:tc>
-          <w:tcPr>
-            <w:tcW w:type="dxa" w:w="1400"/>
-          </w:tcPr>
-          <w:p>
-            <w:r>
-              <w:rPr>
-                <w:b w:val="false"/>
-                <w:bCs w:val="false"/>
-                <w:sz w:val="18"/>
-                <w:szCs w:val="18"/>
-              </w:rPr>
-              <w:t xml:space="preserve">Alta</w:t>
-            </w:r>
-          </w:p>
-        </w:tc>
-        <w:tc>
-          <w:tcPr>
-            <w:tcW w:type="dxa" w:w="1800"/>
-          </w:tcPr>
-          <w:p>
-            <w:r>
-              <w:rPr>
-                <w:b w:val="false"/>
-                <w:bCs w:val="false"/>
-                <w:sz w:val="18"/>
-                <w:szCs w:val="18"/>
-              </w:rPr>
-              <w:t xml:space="preserve">Implementado (pendiente de prueba en dispositivo físico)</w:t>
-            </w:r>
-          </w:p>
-        </w:tc>
-      </w:tr>
-    </w:tbl>
-    <w:p/>
-    <w:p>
-      <w:pPr>
-        <w:pStyle w:val="Heading2"/>
-        <w:spacing w:after="150" w:before="300"/>
-      </w:pPr>
-      <w:r>
-        <w:t xml:space="preserve">4.3 Sprints del proyecto</w:t>
-      </w:r>
-    </w:p>
-    <w:p>
-      <w:r>
-        <w:t xml:space="preserve">El trabajo se organizó en cinco incrementos (sprints), cada uno cerrado únicamente después de verificar en vivo que la funcionalidad entregada funcionaba de punta a punta (no solo que el código compilara).</w:t>
-      </w:r>
-    </w:p>
-    <w:p>
-      <w:pPr>
-        <w:pStyle w:val="Heading3"/>
-        <w:spacing w:after="120" w:before="220"/>
-      </w:pPr>
-      <w:r>
-        <w:t xml:space="preserve">Sprint 1 — Núcleo colaborativo y asistente de IA</w:t>
-      </w:r>
-    </w:p>
-    <w:p>
-      <w:r>
-        <w:t xml:space="preserve">Objetivo del sprint: Habilitar la pizarra compartida en tiempo real y el primer nivel de asistencia por IA.</w:t>
-      </w:r>
-    </w:p>
-    <w:p>
-      <w:pPr>
-        <w:pStyle w:val="ListParagraph"/>
-        <w:numPr>
-          <w:ilvl w:val="0"/>
-          <w:numId w:val="2"/>
-        </w:numPr>
-        <w:spacing w:after="100"/>
-      </w:pPr>
-      <w:r>
-        <w:rPr>
-          <w:b/>
-          <w:bCs/>
-        </w:rPr>
-        <w:t xml:space="preserve">HU1: </w:t>
-      </w:r>
-      <w:r>
-        <w:t xml:space="preserve">pizarra colaborativa con bloqueo por clase, verificado con múltiples clientes conectados a la vez.</w:t>
-      </w:r>
-    </w:p>
-    <w:p>
-      <w:pPr>
-        <w:pStyle w:val="ListParagraph"/>
-        <w:numPr>
-          <w:ilvl w:val="0"/>
-          <w:numId w:val="2"/>
-        </w:numPr>
-        <w:spacing w:after="100"/>
-      </w:pPr>
-      <w:r>
-        <w:rPr>
-          <w:b/>
-          <w:bCs/>
-        </w:rPr>
-        <w:t xml:space="preserve">HU2: </w:t>
-      </w:r>
-      <w:r>
-        <w:t xml:space="preserve">asistente de IA que edita el modelo actual mediante operaciones atómicas en vez de regenerar el diagrama completo, incluyendo dictado por voz.</w:t>
-      </w:r>
-    </w:p>
-    <w:p>
-      <w:pPr>
-        <w:pStyle w:val="Heading3"/>
-        <w:spacing w:after="120" w:before="220"/>
-      </w:pPr>
-      <w:r>
-        <w:t xml:space="preserve">Sprint 2 — Generación de código e interoperabilidad</w:t>
-      </w:r>
-    </w:p>
-    <w:p>
-      <w:r>
-        <w:t xml:space="preserve">Objetivo del sprint: Cerrar el ciclo modelo -&gt; código y modelo &lt;-&gt; otras herramientas UML.</w:t>
-      </w:r>
-    </w:p>
-    <w:p>
-      <w:pPr>
-        <w:pStyle w:val="ListParagraph"/>
-        <w:numPr>
-          <w:ilvl w:val="0"/>
-          <w:numId w:val="2"/>
-        </w:numPr>
-        <w:spacing w:after="100"/>
-      </w:pPr>
-      <w:r>
-        <w:rPr>
-          <w:b/>
-          <w:bCs/>
-        </w:rPr>
-        <w:t xml:space="preserve">HU3: </w:t>
-      </w:r>
-      <w:r>
-        <w:t xml:space="preserve">generador de backend Spring Boot de 4 capas, verificado compilando el proyecto generado con Maven.</w:t>
-      </w:r>
-    </w:p>
-    <w:p>
-      <w:pPr>
-        <w:pStyle w:val="ListParagraph"/>
-        <w:numPr>
-          <w:ilvl w:val="0"/>
-          <w:numId w:val="2"/>
-        </w:numPr>
-        <w:spacing w:after="100"/>
-      </w:pPr>
-      <w:r>
-        <w:rPr>
-          <w:b/>
-          <w:bCs/>
-        </w:rPr>
-        <w:t xml:space="preserve">HU4: </w:t>
-      </w:r>
-      <w:r>
-        <w:t xml:space="preserve">export e import de XMI 2.1, verificado con un round-trip completo (exportar y volver a importar sin pérdida de datos) y con archivos XMI externos.</w:t>
-      </w:r>
-    </w:p>
-    <w:p>
-      <w:pPr>
-        <w:pStyle w:val="Heading3"/>
-        <w:spacing w:after="120" w:before="220"/>
-      </w:pPr>
-      <w:r>
-        <w:t xml:space="preserve">Sprint 3 — Experiencia de una herramienta profesional</w:t>
-      </w:r>
-    </w:p>
-    <w:p>
-      <w:r>
-        <w:t xml:space="preserve">Objetivo del sprint: Acercar el editor al estándar visual y de interacción de un CASE tool real.</w:t>
-      </w:r>
-    </w:p>
-    <w:p>
-      <w:pPr>
-        <w:pStyle w:val="ListParagraph"/>
-        <w:numPr>
-          <w:ilvl w:val="0"/>
-          <w:numId w:val="2"/>
-        </w:numPr>
-        <w:spacing w:after="100"/>
-      </w:pPr>
-      <w:r>
-        <w:rPr>
-          <w:b/>
-          <w:bCs/>
-        </w:rPr>
-        <w:t xml:space="preserve">HU6: </w:t>
-      </w:r>
-      <w:r>
-        <w:t xml:space="preserve">notación UML 2.5 real (herencia, composición, agregación, dependencia, multiplicidad automática), corrigiendo de paso un error de cálculo de multiplicidad en Composición detectado durante la verificación.</w:t>
-      </w:r>
-    </w:p>
-    <w:p>
-      <w:pPr>
-        <w:pStyle w:val="ListParagraph"/>
-        <w:numPr>
-          <w:ilvl w:val="0"/>
-          <w:numId w:val="2"/>
-        </w:numPr>
-        <w:spacing w:after="100"/>
-      </w:pPr>
-      <w:r>
-        <w:rPr>
-          <w:b/>
-          <w:bCs/>
-        </w:rPr>
-        <w:t xml:space="preserve">HU7: </w:t>
-      </w:r>
-      <w:r>
-        <w:t xml:space="preserve">selección múltiple de clases con eliminación en lote.</w:t>
-      </w:r>
-    </w:p>
-    <w:p>
-      <w:pPr>
-        <w:pStyle w:val="ListParagraph"/>
-        <w:numPr>
-          <w:ilvl w:val="0"/>
-          <w:numId w:val="2"/>
-        </w:numPr>
-        <w:spacing w:after="100"/>
-      </w:pPr>
-      <w:r>
-        <w:rPr>
-          <w:b/>
-          <w:bCs/>
-        </w:rPr>
-        <w:t xml:space="preserve">HU8: </w:t>
-      </w:r>
-      <w:r>
-        <w:t xml:space="preserve">exportación del diagrama como imagen PNG/SVG.</w:t>
-      </w:r>
-    </w:p>
-    <w:p>
-      <w:pPr>
-        <w:pStyle w:val="ListParagraph"/>
-        <w:numPr>
-          <w:ilvl w:val="0"/>
-          <w:numId w:val="2"/>
-        </w:numPr>
-        <w:spacing w:after="100"/>
-      </w:pPr>
-      <w:r>
-        <w:rPr>
-          <w:b/>
-          <w:bCs/>
-        </w:rPr>
-        <w:t xml:space="preserve">HU9: </w:t>
-      </w:r>
-      <w:r>
-        <w:t xml:space="preserve">estereotipos de clase abstracta e interfaz, con generación de código Java real para cada caso.</w:t>
-      </w:r>
-    </w:p>
-    <w:p>
-      <w:pPr>
-        <w:pStyle w:val="Heading3"/>
-        <w:spacing w:after="120" w:before="220"/>
-      </w:pPr>
-      <w:r>
-        <w:t xml:space="preserve">Sprint 4 — Autenticación, trazabilidad y almacenamiento</w:t>
-      </w:r>
-    </w:p>
-    <w:p>
-      <w:r>
-        <w:t xml:space="preserve">Objetivo del sprint: Convertir la herramienta en un sistema multiusuario con identidad real y auditoría.</w:t>
-      </w:r>
-    </w:p>
-    <w:p>
-      <w:pPr>
-        <w:pStyle w:val="ListParagraph"/>
-        <w:numPr>
-          <w:ilvl w:val="0"/>
-          <w:numId w:val="2"/>
-        </w:numPr>
-        <w:spacing w:after="100"/>
-      </w:pPr>
-      <w:r>
-        <w:rPr>
-          <w:b/>
-          <w:bCs/>
-        </w:rPr>
-        <w:t xml:space="preserve">HU5: </w:t>
-      </w:r>
-      <w:r>
-        <w:t xml:space="preserve">registro e inicio de sesión con JWT, protegiendo toda la API salvo login/registro.</w:t>
-      </w:r>
-    </w:p>
-    <w:p>
-      <w:pPr>
-        <w:pStyle w:val="ListParagraph"/>
-        <w:numPr>
-          <w:ilvl w:val="0"/>
-          <w:numId w:val="2"/>
-        </w:numPr>
-        <w:spacing w:after="100"/>
-      </w:pPr>
-      <w:r>
-        <w:rPr>
-          <w:b/>
-          <w:bCs/>
-        </w:rPr>
-        <w:t xml:space="preserve">HU10: </w:t>
-      </w:r>
-      <w:r>
-        <w:t xml:space="preserve">bitácora de cambios por diagrama (quién, qué cambió, cuándo), calculada automáticamente comparando el modelo anterior y el nuevo en cada guardado.</w:t>
-      </w:r>
-    </w:p>
-    <w:p>
-      <w:pPr>
-        <w:pStyle w:val="ListParagraph"/>
-        <w:numPr>
-          <w:ilvl w:val="0"/>
-          <w:numId w:val="2"/>
-        </w:numPr>
-        <w:spacing w:after="100"/>
-      </w:pPr>
-      <w:r>
-        <w:rPr>
-          <w:b/>
-          <w:bCs/>
-        </w:rPr>
-        <w:t xml:space="preserve">HU11: </w:t>
-      </w:r>
-      <w:r>
-        <w:t xml:space="preserve">adjuntos por diagrama respaldados en Amazon S3, verificado subiendo, descargando y eliminando un archivo real contra el bucket de AWS.</w:t>
-      </w:r>
-    </w:p>
-    <w:p>
-      <w:pPr>
-        <w:pStyle w:val="Heading3"/>
-        <w:spacing w:after="120" w:before="220"/>
-      </w:pPr>
-      <w:r>
-        <w:t xml:space="preserve">Sprint 5 — Puesta en producción</w:t>
-      </w:r>
-    </w:p>
-    <w:p>
-      <w:r>
-        <w:t xml:space="preserve">Objetivo del sprint: Sacar la aplicación del entorno local y dejarla accesible públicamente.</w:t>
-      </w:r>
-    </w:p>
-    <w:p>
-      <w:pPr>
-        <w:pStyle w:val="ListParagraph"/>
-        <w:numPr>
-          <w:ilvl w:val="0"/>
-          <w:numId w:val="2"/>
-        </w:numPr>
-        <w:spacing w:after="100"/>
-      </w:pPr>
-      <w:r>
-        <w:rPr>
-          <w:b/>
-          <w:bCs/>
-        </w:rPr>
-        <w:t xml:space="preserve">HU12: </w:t>
-      </w:r>
-      <w:r>
-        <w:t xml:space="preserve">despliegue en una instancia EC2 de AWS con IP pública fija, HTTPS en configuración, y verificación end-to-end (registro, login, diagrama, bitácora, S3 y generador) ejecutada contra el servidor real, no contra localhost.</w:t>
-      </w:r>
-    </w:p>
-    <w:p>
-      <w:pPr>
-        <w:pStyle w:val="Heading2"/>
-        <w:spacing w:after="150" w:before="300"/>
-      </w:pPr>
-      <w:r>
-        <w:t xml:space="preserve">4.4 Ceremonias y artefactos aplicados</w:t>
-      </w:r>
-    </w:p>
-    <w:p>
-      <w:pPr>
-        <w:pStyle w:val="ListParagraph"/>
-        <w:numPr>
-          <w:ilvl w:val="0"/>
-          <w:numId w:val="2"/>
-        </w:numPr>
-        <w:spacing w:after="100"/>
-      </w:pPr>
-      <w:r>
-        <w:rPr>
-          <w:b/>
-          <w:bCs/>
-        </w:rPr>
-        <w:t xml:space="preserve">Sprint Planning informal:</w:t>
-      </w:r>
-      <w:r>
-        <w:t xml:space="preserve"> cada incremento arrancó de una petición concreta del Product Owner, muchas veces disparada por revisar una herramienta de referencia (Enterprise Architect, Lucidchart, draw.io, StarUML) y decidir en conjunto qué rescatar para el backlog.</w:t>
-      </w:r>
-    </w:p>
-    <w:p>
-      <w:pPr>
-        <w:pStyle w:val="ListParagraph"/>
-        <w:numPr>
-          <w:ilvl w:val="0"/>
-          <w:numId w:val="2"/>
-        </w:numPr>
-        <w:spacing w:after="100"/>
-      </w:pPr>
-      <w:r>
-        <w:rPr>
-          <w:b/>
-          <w:bCs/>
-        </w:rPr>
-        <w:t xml:space="preserve">Integración continua:</w:t>
-      </w:r>
-      <w:r>
-        <w:t xml:space="preserve"> cada cambio de backend se acompañó de pruebas automatizadas (suite de Vitest, mantenida en verde durante todo el proyecto) antes de integrarse.</w:t>
-      </w:r>
-    </w:p>
-    <w:p>
-      <w:pPr>
-        <w:pStyle w:val="ListParagraph"/>
-        <w:numPr>
-          <w:ilvl w:val="0"/>
-          <w:numId w:val="2"/>
-        </w:numPr>
-        <w:spacing w:after="100"/>
-      </w:pPr>
-      <w:r>
-        <w:rPr>
-          <w:b/>
-          <w:bCs/>
-        </w:rPr>
-        <w:t xml:space="preserve">Sprint Review:</w:t>
-      </w:r>
-      <w:r>
-        <w:t xml:space="preserve"> el cierre de cada incremento incluyó una demostración real (no solo revisión de código): llamadas end-to-end contra la base de datos, contra Amazon S3 real, o contra el navegador con el frontend corriendo, incluyendo el despliegue final verificado contra la IP pública del servidor.</w:t>
-      </w:r>
-    </w:p>
-    <w:p>
-      <w:pPr>
-        <w:pStyle w:val="ListParagraph"/>
-        <w:numPr>
-          <w:ilvl w:val="0"/>
-          <w:numId w:val="2"/>
-        </w:numPr>
-        <w:spacing w:after="100"/>
-      </w:pPr>
-      <w:r>
-        <w:rPr>
-          <w:b/>
-          <w:bCs/>
-        </w:rPr>
-        <w:t xml:space="preserve">Retrospectiva y backlog vivo:</w:t>
-      </w:r>
-      <w:r>
-        <w:t xml:space="preserve"> al cerrar cada incremento se actualizó un checklist de cumplimiento (docs/Checklist_Examen_Final.md) documentando qué quedaba pendiente y por qué, funcionando como registro de mejora continua entre sprints.</w:t>
       </w:r>
     </w:p>
     <w:p>

</xml_diff>

<commit_message>
docs: alinea Perfil al codigo real + subseccion librerias Spring Boot
- Documentacion_del_Proyecto.docx:
  * agrega subseccion 6.3 con la descripcion de las 8 librerias reales del
    backend Spring Boot generado (Java 17, Spring Boot 3.3.4)
  * Perfil (seccion 1): agrega cliente movil Flutter, IA local/offline,
    importacion XMI (Enterprise Architect), presencia y bloqueo por clase
    en colaboracion, y nuevo Modulo Cliente Movil en el Alcance
- agrega DEFENSA_ORAL.md (guion partes 3 y 4) y snippets de referencia

Co-Authored-By: Claude Opus 4.8 <noreply@anthropic.com>
</commit_message>
<xml_diff>
--- a/docs/Documentacion_del_Proyecto.docx
+++ b/docs/Documentacion_del_Proyecto.docx
@@ -1396,6 +1396,191 @@
     </w:p>
     <w:p>
       <w:pPr>
+        <w:pStyle w:val="Heading3"/>
+        <w:spacing w:after="120" w:before="220"/>
+      </w:pPr>
+      <w:r>
+        <w:t xml:space="preserve">6.3 Librerías y dependencias utilizadas</w:t>
+      </w:r>
+    </w:p>
+    <w:p>
+      <w:pPr>
+        <w:spacing w:after="160"/>
+      </w:pPr>
+      <w:r>
+        <w:t xml:space="preserve">El backend generado es un proyecto Maven estándar sobre Spring Boot 3.3.4 y Java 17, heredando la gestión de versiones del spring-boot-starter-parent (BOM que fija versiones compatibles entre todas las dependencias, evitando conflictos manuales). Cada librería incluida responde a una necesidad concreta de la arquitectura en cuatro capas; no se agregó ninguna dependencia superflua.</w:t>
+      </w:r>
+    </w:p>
+    <w:p>
+      <w:pPr>
+        <w:pStyle w:val="ListParagraph"/>
+        <w:numPr>
+          <w:ilvl w:val="0"/>
+          <w:numId w:val="2"/>
+        </w:numPr>
+        <w:spacing w:after="100"/>
+      </w:pPr>
+      <w:r>
+        <w:rPr>
+          <w:b/>
+          <w:bCs/>
+        </w:rPr>
+        <w:t xml:space="preserve">spring-boot-starter-web — </w:t>
+      </w:r>
+      <w:r>
+        <w:t xml:space="preserve">expone la capa de controladores como una API REST. Incluye el servidor embebido Tomcat, el framework Spring MVC y la librería de serialización Jackson, permitiendo que el backend arranque de forma autónoma (java -jar) sin necesidad de desplegar en un servidor de aplicaciones externo.</w:t>
+      </w:r>
+    </w:p>
+    <w:p>
+      <w:pPr>
+        <w:pStyle w:val="ListParagraph"/>
+        <w:numPr>
+          <w:ilvl w:val="0"/>
+          <w:numId w:val="2"/>
+        </w:numPr>
+        <w:spacing w:after="100"/>
+      </w:pPr>
+      <w:r>
+        <w:rPr>
+          <w:b/>
+          <w:bCs/>
+        </w:rPr>
+        <w:t xml:space="preserve">spring-boot-starter-data-jpa — </w:t>
+      </w:r>
+      <w:r>
+        <w:t xml:space="preserve">provee la capa de persistencia mediante JPA (Jakarta Persistence API) con Hibernate como implementación ORM. Es la librería que permite que cada @Entity del diagrama se mapee automáticamente a una tabla, y que los repositorios (JpaRepository) ofrezcan las operaciones CRUD sin escribir SQL.</w:t>
+      </w:r>
+    </w:p>
+    <w:p>
+      <w:pPr>
+        <w:pStyle w:val="ListParagraph"/>
+        <w:numPr>
+          <w:ilvl w:val="0"/>
+          <w:numId w:val="2"/>
+        </w:numPr>
+        <w:spacing w:after="100"/>
+      </w:pPr>
+      <w:r>
+        <w:rPr>
+          <w:b/>
+          <w:bCs/>
+        </w:rPr>
+        <w:t xml:space="preserve">postgresql — </w:t>
+      </w:r>
+      <w:r>
+        <w:t xml:space="preserve">driver JDBC de PostgreSQL. Es el puente entre Hibernate y la base de datos relacional; sin él, la aplicación no podría abrir conexiones al motor PostgreSQL configurado en application.properties.</w:t>
+      </w:r>
+    </w:p>
+    <w:p>
+      <w:pPr>
+        <w:pStyle w:val="ListParagraph"/>
+        <w:numPr>
+          <w:ilvl w:val="0"/>
+          <w:numId w:val="2"/>
+        </w:numPr>
+        <w:spacing w:after="100"/>
+      </w:pPr>
+      <w:r>
+        <w:rPr>
+          <w:b/>
+          <w:bCs/>
+        </w:rPr>
+        <w:t xml:space="preserve">spring-boot-starter-validation — </w:t>
+      </w:r>
+      <w:r>
+        <w:t xml:space="preserve">integra Jakarta Bean Validation (Hibernate Validator). Habilita la validación declarativa de los datos que entran por los endpoints mediante anotaciones (@NotNull, @Size, etc.), reforzando la integridad de la información antes de persistirla.</w:t>
+      </w:r>
+    </w:p>
+    <w:p>
+      <w:pPr>
+        <w:pStyle w:val="ListParagraph"/>
+        <w:numPr>
+          <w:ilvl w:val="0"/>
+          <w:numId w:val="2"/>
+        </w:numPr>
+        <w:spacing w:after="100"/>
+      </w:pPr>
+      <w:r>
+        <w:rPr>
+          <w:b/>
+          <w:bCs/>
+        </w:rPr>
+        <w:t xml:space="preserve">jackson-datatype-hibernate6 — </w:t>
+      </w:r>
+      <w:r>
+        <w:t xml:space="preserve">módulo de Jackson que resuelve un problema real detectado durante el desarrollo: la serialización a JSON de los proxies perezosos (lazy) de Hibernate. Sin este módulo, exponer entidades con relaciones perezosas por la API provocaría errores de serialización. Se registra junto con @JsonIgnoreProperties para evitar además la recursión infinita en relaciones bidireccionales.</w:t>
+      </w:r>
+    </w:p>
+    <w:p>
+      <w:pPr>
+        <w:pStyle w:val="ListParagraph"/>
+        <w:numPr>
+          <w:ilvl w:val="0"/>
+          <w:numId w:val="2"/>
+        </w:numPr>
+        <w:spacing w:after="100"/>
+      </w:pPr>
+      <w:r>
+        <w:rPr>
+          <w:b/>
+          <w:bCs/>
+        </w:rPr>
+        <w:t xml:space="preserve">springdoc-openapi-starter-webmvc-ui (versión 2.6.0) — </w:t>
+      </w:r>
+      <w:r>
+        <w:t xml:space="preserve">genera de forma automática la especificación OpenAPI 3 de todos los controladores y sirve una interfaz Swagger UI navegable en /swagger-ui.html. Permite al evaluador (o a cualquier consumidor del backend) explorar y probar los endpoints desde el navegador sin herramientas externas, complementando las pruebas con Postman.</w:t>
+      </w:r>
+    </w:p>
+    <w:p>
+      <w:pPr>
+        <w:pStyle w:val="ListParagraph"/>
+        <w:numPr>
+          <w:ilvl w:val="0"/>
+          <w:numId w:val="2"/>
+        </w:numPr>
+        <w:spacing w:after="100"/>
+      </w:pPr>
+      <w:r>
+        <w:rPr>
+          <w:b/>
+          <w:bCs/>
+        </w:rPr>
+        <w:t xml:space="preserve">spring-boot-starter-test (ámbito test) — </w:t>
+      </w:r>
+      <w:r>
+        <w:t xml:space="preserve">suite de pruebas que agrupa JUnit 5, Mockito, AssertJ y Spring Test. Queda disponible en el proyecto generado para que el desarrollador añada pruebas unitarias y de integración sobre la lógica de negocio de la capa de servicio.</w:t>
+      </w:r>
+    </w:p>
+    <w:p>
+      <w:pPr>
+        <w:pStyle w:val="ListParagraph"/>
+        <w:numPr>
+          <w:ilvl w:val="0"/>
+          <w:numId w:val="2"/>
+        </w:numPr>
+        <w:spacing w:after="100"/>
+      </w:pPr>
+      <w:r>
+        <w:rPr>
+          <w:b/>
+          <w:bCs/>
+        </w:rPr>
+        <w:t xml:space="preserve">spring-boot-maven-plugin (plugin de build) — </w:t>
+      </w:r>
+      <w:r>
+        <w:t xml:space="preserve">empaqueta la aplicación como un JAR ejecutable auto-contenido (fat JAR) que incluye todas las dependencias y el servidor embebido, de modo que el backend se ejecuta con un único comando y es directamente contenedorizable con Docker.</w:t>
+      </w:r>
+    </w:p>
+    <w:p>
+      <w:pPr>
+        <w:spacing w:after="160"/>
+      </w:pPr>
+      <w:r>
+        <w:t xml:space="preserve">En conjunto, estas dependencias materializan la arquitectura en capas Controlador → Servicio → Repositorio → Entidad descrita en 6.1: spring-boot-starter-web para la capa de exposición, spring-boot-starter-data-jpa y el driver postgresql para la persistencia, spring-boot-starter-validation y los módulos de Jackson para la integridad y correcta serialización de los datos, y springdoc-openapi para la documentación viva de la API. La selección se mantuvo deliberadamente mínima y estándar para que el backend generado sea fácil de entender, extender y defender.</w:t>
+      </w:r>
+    </w:p>
+    <w:p>
+      <w:pPr>
         <w:pStyle w:val="Heading1"/>
         <w:spacing w:after="200" w:before="500"/>
       </w:pPr>
@@ -1794,7 +1979,7 @@
         <w:spacing w:after="100"/>
       </w:pPr>
       <w:r>
-        <w:t xml:space="preserve">Implementar la exportación del diagrama a formato estándar XMI 2.1 para su uso en herramientas UML externas.</w:t>
+        <w:t xml:space="preserve">Implementar la importación y exportación del diagrama en formato estándar XMI 2.1 para interoperar con herramientas UML externas como Enterprise Architect.</w:t>
       </w:r>
     </w:p>
     <w:p>
@@ -1873,6 +2058,32 @@
       </w:pPr>
       <w:r>
         <w:t xml:space="preserve">Desplegar la aplicación en un servidor accesible públicamente (AWS), verificando su funcionamiento fuera de un entorno local.</w:t>
+      </w:r>
+    </w:p>
+    <w:p>
+      <w:pPr>
+        <w:pStyle w:val="ListParagraph"/>
+        <w:numPr>
+          <w:ilvl w:val="0"/>
+          <w:numId w:val="2"/>
+        </w:numPr>
+        <w:spacing w:after="100"/>
+      </w:pPr>
+      <w:r>
+        <w:t xml:space="preserve">Desarrollar un cliente móvil en Flutter que consuma el backend generado, con interacción por voz y operación sin conexión (offline) que sincroniza los cambios al reconectar.</w:t>
+      </w:r>
+    </w:p>
+    <w:p>
+      <w:pPr>
+        <w:pStyle w:val="ListParagraph"/>
+        <w:numPr>
+          <w:ilvl w:val="0"/>
+          <w:numId w:val="2"/>
+        </w:numPr>
+        <w:spacing w:after="100"/>
+      </w:pPr>
+      <w:r>
+        <w:t xml:space="preserve">Habilitar el uso de modelos de inteligencia artificial locales, tanto en escritorio como en el dispositivo móvil, para asistir al usuario incluso sin conexión a internet.</w:t>
       </w:r>
     </w:p>
     <w:p>
@@ -1932,7 +2143,7 @@
         <w:spacing w:after="160"/>
       </w:pPr>
       <w:r>
-        <w:t xml:space="preserve">Sincroniza los cambios del diagrama en tiempo real entre todos los usuarios conectados a la misma sesión de edición.</w:t>
+        <w:t xml:space="preserve">Sincroniza los cambios del diagrama en tiempo real entre todos los usuarios conectados a la misma sesión de edición. Muestra la presencia de los usuarios conectados y aplica control de exclusión mediante bloqueo por clase: mientras un usuario edita una clase, esta queda bloqueada para los demás y se libera al terminar la edición.</w:t>
       </w:r>
     </w:p>
     <w:p>
@@ -1949,7 +2160,24 @@
         <w:spacing w:after="160"/>
       </w:pPr>
       <w:r>
-        <w:t xml:space="preserve">Provee el chat conversacional, el reconocimiento de voz y la interpretación de fotografías dibujadas a mano.</w:t>
+        <w:t xml:space="preserve">Provee el chat conversacional, el reconocimiento de voz y la interpretación de fotografías dibujadas a mano. Puede operar con modelos de IA en la nube (Google Gemini) o con modelos locales, en escritorio y en el dispositivo móvil, para funcionar sin conexión a internet.</w:t>
+      </w:r>
+    </w:p>
+    <w:p>
+      <w:pPr>
+        <w:pStyle w:val="Heading3"/>
+        <w:spacing w:after="120" w:before="220"/>
+      </w:pPr>
+      <w:r>
+        <w:t xml:space="preserve">Módulo Cliente Móvil</w:t>
+      </w:r>
+    </w:p>
+    <w:p>
+      <w:pPr>
+        <w:spacing w:after="160"/>
+      </w:pPr>
+      <w:r>
+        <w:t xml:space="preserve">Aplicación desarrollada en Flutter que consume el backend generado para probar sus endpoints. Ofrece interacción por voz, un asistente de inteligencia artificial local y operación offline que encola las acciones realizadas sin conexión y las sincroniza al recuperar la conectividad.</w:t>
       </w:r>
     </w:p>
     <w:p>

</xml_diff>

<commit_message>
docs: agrega Anexo B - Estandar de Codificacion
Documenta el estandar de codificacion anclado al toolchain real del
proyecto (TypeScript strict, oxlint, Prettier, vitest, flutter_lints,
Spring Boot/Java 17, UML 2.5/XMI, ISO/IEC 25010). Insertado como Anexo B
entre el Anexo A (evidencia) y las Referencias.

Co-Authored-By: Claude Opus 4.8 <noreply@anthropic.com>
</commit_message>
<xml_diff>
--- a/docs/Documentacion_del_Proyecto.docx
+++ b/docs/Documentacion_del_Proyecto.docx
@@ -9849,6 +9849,473 @@
       </w:pPr>
       <w:r>
         <w:t xml:space="preserve">La evidencia incluida en las secciones 4.3 y 5.2 de este documento corresponde al sistema en ejecución real, no a mockups: una captura del lienzo interactivo con clases y relaciones dibujadas por el usuario (incluyendo el indicador de colaboración en tiempo real), y la transcripción literal de una consulta real respondida por el asistente de IA durante una sesión de pruebas del sistema.</w:t>
+      </w:r>
+    </w:p>
+    <w:p>
+      <w:pPr>
+        <w:pStyle w:val="Heading2"/>
+        <w:spacing w:after="150" w:before="300"/>
+      </w:pPr>
+      <w:r>
+        <w:t xml:space="preserve">Anexo B — Estándar de Codificación</w:t>
+      </w:r>
+    </w:p>
+    <w:p>
+      <w:pPr>
+        <w:pStyle w:val="Heading3"/>
+        <w:spacing w:after="120" w:before="220"/>
+      </w:pPr>
+      <w:r>
+        <w:t xml:space="preserve">1. Introducción</w:t>
+      </w:r>
+    </w:p>
+    <w:p>
+      <w:pPr>
+        <w:spacing w:after="160"/>
+      </w:pPr>
+      <w:r>
+        <w:t xml:space="preserve">El presente estándar define las convenciones, herramientas y prácticas aplicadas durante la construcción del proyecto, con el fin de garantizar un código legible, uniforme y mantenible a través de las distintas tecnologías que lo componen: el backend en TypeScript (NestJS), el frontend en TypeScript (React), el cliente móvil en Dart (Flutter) y el código Java (Spring Boot) producido por el motor generador. La adopción de un estándar común reduce los errores de transcripción, facilita el trabajo colaborativo y asegura la coherencia del producto final.</w:t>
+      </w:r>
+    </w:p>
+    <w:p>
+      <w:pPr>
+        <w:pStyle w:val="Heading3"/>
+        <w:spacing w:after="120" w:before="220"/>
+      </w:pPr>
+      <w:r>
+        <w:t xml:space="preserve">2. Estándares Internacionales Implementados</w:t>
+      </w:r>
+    </w:p>
+    <w:p>
+      <w:pPr>
+        <w:pStyle w:val="ListParagraph"/>
+        <w:numPr>
+          <w:ilvl w:val="0"/>
+          <w:numId w:val="2"/>
+        </w:numPr>
+        <w:spacing w:after="100"/>
+      </w:pPr>
+      <w:r>
+        <w:rPr>
+          <w:b/>
+          <w:bCs/>
+        </w:rPr>
+        <w:t xml:space="preserve">UML 2.5 (OMG): </w:t>
+      </w:r>
+      <w:r>
+        <w:t xml:space="preserve">notación estándar para el modelado de los diagramas de clases, base conceptual de toda la herramienta.</w:t>
+      </w:r>
+    </w:p>
+    <w:p>
+      <w:pPr>
+        <w:pStyle w:val="ListParagraph"/>
+        <w:numPr>
+          <w:ilvl w:val="0"/>
+          <w:numId w:val="2"/>
+        </w:numPr>
+        <w:spacing w:after="100"/>
+      </w:pPr>
+      <w:r>
+        <w:rPr>
+          <w:b/>
+          <w:bCs/>
+        </w:rPr>
+        <w:t xml:space="preserve">XMI 2.1 (OMG): </w:t>
+      </w:r>
+      <w:r>
+        <w:t xml:space="preserve">formato estándar de intercambio de modelos para la importación y exportación con herramientas externas como Enterprise Architect.</w:t>
+      </w:r>
+    </w:p>
+    <w:p>
+      <w:pPr>
+        <w:pStyle w:val="ListParagraph"/>
+        <w:numPr>
+          <w:ilvl w:val="0"/>
+          <w:numId w:val="2"/>
+        </w:numPr>
+        <w:spacing w:after="100"/>
+      </w:pPr>
+      <w:r>
+        <w:rPr>
+          <w:b/>
+          <w:bCs/>
+        </w:rPr>
+        <w:t xml:space="preserve">OpenAPI 3 / REST: </w:t>
+      </w:r>
+      <w:r>
+        <w:t xml:space="preserve">los endpoints generados siguen el estilo arquitectónico REST y se documentan con la especificación OpenAPI 3 (Swagger UI).</w:t>
+      </w:r>
+    </w:p>
+    <w:p>
+      <w:pPr>
+        <w:pStyle w:val="ListParagraph"/>
+        <w:numPr>
+          <w:ilvl w:val="0"/>
+          <w:numId w:val="2"/>
+        </w:numPr>
+        <w:spacing w:after="100"/>
+      </w:pPr>
+      <w:r>
+        <w:rPr>
+          <w:b/>
+          <w:bCs/>
+        </w:rPr>
+        <w:t xml:space="preserve">ISO/IEC 25010: </w:t>
+      </w:r>
+      <w:r>
+        <w:t xml:space="preserve">atributos de calidad (mantenibilidad, portabilidad y fiabilidad) tomados como referencia del producto software.</w:t>
+      </w:r>
+    </w:p>
+    <w:p>
+      <w:pPr>
+        <w:pStyle w:val="ListParagraph"/>
+        <w:numPr>
+          <w:ilvl w:val="0"/>
+          <w:numId w:val="2"/>
+        </w:numPr>
+        <w:spacing w:after="100"/>
+      </w:pPr>
+      <w:r>
+        <w:rPr>
+          <w:b/>
+          <w:bCs/>
+        </w:rPr>
+        <w:t xml:space="preserve">Convenciones de nomenclatura: </w:t>
+      </w:r>
+      <w:r>
+        <w:t xml:space="preserve">TypeScript y Dart en camelCase (variables/funciones) y PascalCase (clases, tipos, componentes); Java en PascalCase para clases y camelCase para métodos, según Spring Boot; tablas de base de datos en snake_case.</w:t>
+      </w:r>
+    </w:p>
+    <w:p>
+      <w:pPr>
+        <w:pStyle w:val="ListParagraph"/>
+        <w:numPr>
+          <w:ilvl w:val="0"/>
+          <w:numId w:val="2"/>
+        </w:numPr>
+        <w:spacing w:after="100"/>
+      </w:pPr>
+      <w:r>
+        <w:rPr>
+          <w:b/>
+          <w:bCs/>
+        </w:rPr>
+        <w:t xml:space="preserve">Arquitectura en capas: </w:t>
+      </w:r>
+      <w:r>
+        <w:t xml:space="preserve">el backend generado respeta el patrón Controlador → Servicio → Repositorio → Entidad.</w:t>
+      </w:r>
+    </w:p>
+    <w:p>
+      <w:pPr>
+        <w:pStyle w:val="Heading3"/>
+        <w:spacing w:after="120" w:before="220"/>
+      </w:pPr>
+      <w:r>
+        <w:t xml:space="preserve">3. Stack Tecnológico y Herramientas de Calidad</w:t>
+      </w:r>
+    </w:p>
+    <w:p>
+      <w:pPr>
+        <w:spacing w:after="160"/>
+      </w:pPr>
+      <w:r>
+        <w:t xml:space="preserve">El backend de la herramienta CASE está construido en NestJS + TypeScript (modo strict) con TypeORM y PostgreSQL; el frontend en React + Vite + TypeScript con React Flow; el cliente móvil en Flutter/Dart; y la salida generada en Spring Boot 3.3.4 con Java 17 y Maven. El aseguramiento de la calidad se apoya en herramientas automáticas:</w:t>
+      </w:r>
+    </w:p>
+    <w:p>
+      <w:pPr>
+        <w:pStyle w:val="ListParagraph"/>
+        <w:numPr>
+          <w:ilvl w:val="0"/>
+          <w:numId w:val="2"/>
+        </w:numPr>
+        <w:spacing w:after="100"/>
+      </w:pPr>
+      <w:r>
+        <w:rPr>
+          <w:b/>
+          <w:bCs/>
+        </w:rPr>
+        <w:t xml:space="preserve">oxlint: </w:t>
+      </w:r>
+      <w:r>
+        <w:t xml:space="preserve">analizador estático (linter) del código TypeScript en backend y frontend, que detecta errores y malas prácticas antes de la ejecución.</w:t>
+      </w:r>
+    </w:p>
+    <w:p>
+      <w:pPr>
+        <w:pStyle w:val="ListParagraph"/>
+        <w:numPr>
+          <w:ilvl w:val="0"/>
+          <w:numId w:val="2"/>
+        </w:numPr>
+        <w:spacing w:after="100"/>
+      </w:pPr>
+      <w:r>
+        <w:rPr>
+          <w:b/>
+          <w:bCs/>
+        </w:rPr>
+        <w:t xml:space="preserve">Prettier: </w:t>
+      </w:r>
+      <w:r>
+        <w:t xml:space="preserve">formateador automático con configuración uniforme (comillas simples y coma final en estructuras multilínea), evitando diffs ruidosos.</w:t>
+      </w:r>
+    </w:p>
+    <w:p>
+      <w:pPr>
+        <w:pStyle w:val="ListParagraph"/>
+        <w:numPr>
+          <w:ilvl w:val="0"/>
+          <w:numId w:val="2"/>
+        </w:numPr>
+        <w:spacing w:after="100"/>
+      </w:pPr>
+      <w:r>
+        <w:rPr>
+          <w:b/>
+          <w:bCs/>
+        </w:rPr>
+        <w:t xml:space="preserve">TypeScript strict: </w:t>
+      </w:r>
+      <w:r>
+        <w:t xml:space="preserve">verificación estricta de tipos en tiempo de compilación en backend y frontend.</w:t>
+      </w:r>
+    </w:p>
+    <w:p>
+      <w:pPr>
+        <w:pStyle w:val="ListParagraph"/>
+        <w:numPr>
+          <w:ilvl w:val="0"/>
+          <w:numId w:val="2"/>
+        </w:numPr>
+        <w:spacing w:after="100"/>
+      </w:pPr>
+      <w:r>
+        <w:rPr>
+          <w:b/>
+          <w:bCs/>
+        </w:rPr>
+        <w:t xml:space="preserve">vitest: </w:t>
+      </w:r>
+      <w:r>
+        <w:t xml:space="preserve">pruebas unitarias y de integración del backend, con medición de cobertura y pruebas end-to-end.</w:t>
+      </w:r>
+    </w:p>
+    <w:p>
+      <w:pPr>
+        <w:pStyle w:val="ListParagraph"/>
+        <w:numPr>
+          <w:ilvl w:val="0"/>
+          <w:numId w:val="2"/>
+        </w:numPr>
+        <w:spacing w:after="100"/>
+      </w:pPr>
+      <w:r>
+        <w:rPr>
+          <w:b/>
+          <w:bCs/>
+        </w:rPr>
+        <w:t xml:space="preserve">flutter_lints y flutter analyze: </w:t>
+      </w:r>
+      <w:r>
+        <w:t xml:space="preserve">reglas de análisis estático oficiales para el código Dart del cliente móvil.</w:t>
+      </w:r>
+    </w:p>
+    <w:p>
+      <w:pPr>
+        <w:pStyle w:val="Heading3"/>
+        <w:spacing w:after="120" w:before="220"/>
+      </w:pPr>
+      <w:r>
+        <w:t xml:space="preserve">4. Configuración del Entorno de Desarrollo</w:t>
+      </w:r>
+    </w:p>
+    <w:p>
+      <w:pPr>
+        <w:pStyle w:val="ListParagraph"/>
+        <w:numPr>
+          <w:ilvl w:val="0"/>
+          <w:numId w:val="2"/>
+        </w:numPr>
+        <w:spacing w:after="100"/>
+      </w:pPr>
+      <w:r>
+        <w:rPr>
+          <w:b/>
+          <w:bCs/>
+        </w:rPr>
+        <w:t xml:space="preserve">Requisitos: </w:t>
+      </w:r>
+      <w:r>
+        <w:t xml:space="preserve">Node.js 22+, PostgreSQL en localhost:5432 y el SDK de Flutter.</w:t>
+      </w:r>
+    </w:p>
+    <w:p>
+      <w:pPr>
+        <w:pStyle w:val="ListParagraph"/>
+        <w:numPr>
+          <w:ilvl w:val="0"/>
+          <w:numId w:val="2"/>
+        </w:numPr>
+        <w:spacing w:after="100"/>
+      </w:pPr>
+      <w:r>
+        <w:rPr>
+          <w:b/>
+          <w:bCs/>
+        </w:rPr>
+        <w:t xml:space="preserve">Variables de entorno (.env, nunca versionadas): </w:t>
+      </w:r>
+      <w:r>
+        <w:t xml:space="preserve">credenciales de base de datos, GEMINI_API_KEY y AI_PROVIDER (para alternar entre IA en la nube y la IA local).</w:t>
+      </w:r>
+    </w:p>
+    <w:p>
+      <w:pPr>
+        <w:pStyle w:val="ListParagraph"/>
+        <w:numPr>
+          <w:ilvl w:val="0"/>
+          <w:numId w:val="2"/>
+        </w:numPr>
+        <w:spacing w:after="100"/>
+      </w:pPr>
+      <w:r>
+        <w:rPr>
+          <w:b/>
+          <w:bCs/>
+        </w:rPr>
+        <w:t xml:space="preserve">Comandos estandarizados: </w:t>
+      </w:r>
+      <w:r>
+        <w:t xml:space="preserve">npm run start:dev (desarrollo con recarga en caliente), npm run lint (oxlint), npm run format (Prettier), npm test y npm run test:cov (vitest), npm run test:e2e (end-to-end).</w:t>
+      </w:r>
+    </w:p>
+    <w:p>
+      <w:pPr>
+        <w:pStyle w:val="ListParagraph"/>
+        <w:numPr>
+          <w:ilvl w:val="0"/>
+          <w:numId w:val="2"/>
+        </w:numPr>
+        <w:spacing w:after="100"/>
+      </w:pPr>
+      <w:r>
+        <w:rPr>
+          <w:b/>
+          <w:bCs/>
+        </w:rPr>
+        <w:t xml:space="preserve">Formateo automático al guardar </w:t>
+      </w:r>
+      <w:r>
+        <w:t xml:space="preserve">habilitado en el editor, para mantener el estilo sin intervención manual.</w:t>
+      </w:r>
+    </w:p>
+    <w:p>
+      <w:pPr>
+        <w:pStyle w:val="Heading3"/>
+        <w:spacing w:after="120" w:before="220"/>
+      </w:pPr>
+      <w:r>
+        <w:t xml:space="preserve">5. Flujo de Trabajo y Métricas</w:t>
+      </w:r>
+    </w:p>
+    <w:p>
+      <w:pPr>
+        <w:pStyle w:val="ListParagraph"/>
+        <w:numPr>
+          <w:ilvl w:val="0"/>
+          <w:numId w:val="2"/>
+        </w:numPr>
+        <w:spacing w:after="100"/>
+      </w:pPr>
+      <w:r>
+        <w:rPr>
+          <w:b/>
+          <w:bCs/>
+        </w:rPr>
+        <w:t xml:space="preserve">Control de versiones con Git: </w:t>
+      </w:r>
+      <w:r>
+        <w:t xml:space="preserve">cada avance se registra en commits con mensajes descriptivos y prefijos convencionales (feat, fix, docs), trazando la evolución del proyecto.</w:t>
+      </w:r>
+    </w:p>
+    <w:p>
+      <w:pPr>
+        <w:pStyle w:val="ListParagraph"/>
+        <w:numPr>
+          <w:ilvl w:val="0"/>
+          <w:numId w:val="2"/>
+        </w:numPr>
+        <w:spacing w:after="100"/>
+      </w:pPr>
+      <w:r>
+        <w:rPr>
+          <w:b/>
+          <w:bCs/>
+        </w:rPr>
+        <w:t xml:space="preserve">Verificación previa a la integración: </w:t>
+      </w:r>
+      <w:r>
+        <w:t xml:space="preserve">antes de validar un cambio se ejecutan el linter (oxlint / flutter analyze), el formateador y las pruebas automatizadas.</w:t>
+      </w:r>
+    </w:p>
+    <w:p>
+      <w:pPr>
+        <w:pStyle w:val="ListParagraph"/>
+        <w:numPr>
+          <w:ilvl w:val="0"/>
+          <w:numId w:val="2"/>
+        </w:numPr>
+        <w:spacing w:after="100"/>
+      </w:pPr>
+      <w:r>
+        <w:rPr>
+          <w:b/>
+          <w:bCs/>
+        </w:rPr>
+        <w:t xml:space="preserve">Métricas de calidad: </w:t>
+      </w:r>
+      <w:r>
+        <w:t xml:space="preserve">suite de pruebas del backend en verde con cobertura medida; verificación estricta de tipos (TypeScript strict); y pruebas específicas del motor generador que validan el pom.xml y las plantillas producidas.</w:t>
+      </w:r>
+    </w:p>
+    <w:p>
+      <w:pPr>
+        <w:pStyle w:val="ListParagraph"/>
+        <w:numPr>
+          <w:ilvl w:val="0"/>
+          <w:numId w:val="2"/>
+        </w:numPr>
+        <w:spacing w:after="100"/>
+      </w:pPr>
+      <w:r>
+        <w:rPr>
+          <w:b/>
+          <w:bCs/>
+        </w:rPr>
+        <w:t xml:space="preserve">Revisión de código: </w:t>
+      </w:r>
+      <w:r>
+        <w:t xml:space="preserve">el conocimiento del código por parte de los autores se verifica en la defensa presencial de autoría.</w:t>
+      </w:r>
+    </w:p>
+    <w:p>
+      <w:pPr>
+        <w:pStyle w:val="Heading3"/>
+        <w:spacing w:after="120" w:before="220"/>
+      </w:pPr>
+      <w:r>
+        <w:t xml:space="preserve">6. Conclusión</w:t>
+      </w:r>
+    </w:p>
+    <w:p>
+      <w:pPr>
+        <w:spacing w:after="160"/>
+      </w:pPr>
+      <w:r>
+        <w:t xml:space="preserve">La aplicación de este estándar —soportado por herramientas automáticas de análisis estático, formateo, verificación de tipos y pruebas— asegura un nivel de calidad consistente a pesar de combinar cuatro lenguajes y plataformas distintas. El estándar no es solo un conjunto de recomendaciones: está respaldado por herramientas que lo hacen cumplir de forma automática, reduciendo la deuda técnica y facilitando la mantenibilidad y evolución futura del sistema.</w:t>
       </w:r>
     </w:p>
     <w:p>

</xml_diff>

<commit_message>
docs: documenta artefactos generados (Postman, schema.sql, data.sql)
Agrega subseccion 6.4 "Artefactos adicionales generados" describiendo la
coleccion Postman, el schema.sql y el data.sql que el generador incluye en
el ZIP, mas la exportacion Postman y la vista previa de codigo del frontend.
Extiende el Modulo Generador del Alcance en consecuencia.

Co-Authored-By: Claude Opus 4.8 <noreply@anthropic.com>
</commit_message>
<xml_diff>
--- a/docs/Documentacion_del_Proyecto.docx
+++ b/docs/Documentacion_del_Proyecto.docx
@@ -1581,6 +1581,91 @@
     </w:p>
     <w:p>
       <w:pPr>
+        <w:pStyle w:val="Heading3"/>
+        <w:spacing w:after="120" w:before="220"/>
+      </w:pPr>
+      <w:r>
+        <w:t xml:space="preserve">6.4 Artefactos adicionales generados</w:t>
+      </w:r>
+    </w:p>
+    <w:p>
+      <w:pPr>
+        <w:spacing w:after="160"/>
+      </w:pPr>
+      <w:r>
+        <w:t xml:space="preserve">Además del código Java de las cuatro capas, el proyecto generado incluye archivos que facilitan su prueba y despliegue inmediato:</w:t>
+      </w:r>
+    </w:p>
+    <w:p>
+      <w:pPr>
+        <w:pStyle w:val="ListParagraph"/>
+        <w:numPr>
+          <w:ilvl w:val="0"/>
+          <w:numId w:val="2"/>
+        </w:numPr>
+        <w:spacing w:after="100"/>
+      </w:pPr>
+      <w:r>
+        <w:rPr>
+          <w:b/>
+          <w:bCs/>
+        </w:rPr>
+        <w:t xml:space="preserve">postman_collection.json: </w:t>
+      </w:r>
+      <w:r>
+        <w:t xml:space="preserve">colección Postman v2.1 con todos los endpoints CRUD de cada clase, lista para importar en Postman y probar el backend sin configuración manual.</w:t>
+      </w:r>
+    </w:p>
+    <w:p>
+      <w:pPr>
+        <w:pStyle w:val="ListParagraph"/>
+        <w:numPr>
+          <w:ilvl w:val="0"/>
+          <w:numId w:val="2"/>
+        </w:numPr>
+        <w:spacing w:after="100"/>
+      </w:pPr>
+      <w:r>
+        <w:rPr>
+          <w:b/>
+          <w:bCs/>
+        </w:rPr>
+        <w:t xml:space="preserve">src/main/resources/schema.sql: </w:t>
+      </w:r>
+      <w:r>
+        <w:t xml:space="preserve">script DDL con la definición de todas las tablas y sus claves foráneas, compatible con PostgreSQL, H2 y MySQL (sintaxis ANSI).</w:t>
+      </w:r>
+    </w:p>
+    <w:p>
+      <w:pPr>
+        <w:pStyle w:val="ListParagraph"/>
+        <w:numPr>
+          <w:ilvl w:val="0"/>
+          <w:numId w:val="2"/>
+        </w:numPr>
+        <w:spacing w:after="100"/>
+      </w:pPr>
+      <w:r>
+        <w:rPr>
+          <w:b/>
+          <w:bCs/>
+        </w:rPr>
+        <w:t xml:space="preserve">src/main/resources/data.sql: </w:t>
+      </w:r>
+      <w:r>
+        <w:t xml:space="preserve">datos de prueba realistas, ordenados para respetar las claves foráneas (las entidades padre se insertan antes que las hijas), de modo que el sistema arranque con información de ejemplo.</w:t>
+      </w:r>
+    </w:p>
+    <w:p>
+      <w:pPr>
+        <w:spacing w:after="160"/>
+      </w:pPr>
+      <w:r>
+        <w:t xml:space="preserve">Adicionalmente, la herramienta web permite exportar la colección Postman directamente desde el diagrama, sin necesidad de generar todo el proyecto, y ofrece una vista previa del código generado antes de la descarga.</w:t>
+      </w:r>
+    </w:p>
+    <w:p>
+      <w:pPr>
         <w:pStyle w:val="Heading1"/>
         <w:spacing w:after="200" w:before="500"/>
       </w:pPr>
@@ -2126,7 +2211,7 @@
         <w:spacing w:after="160"/>
       </w:pPr>
       <w:r>
-        <w:t xml:space="preserve">Transforma el modelo UML en un proyecto Spring Boot completo (Entity, Repository, Service, Controller) y en un archivo XMI.</w:t>
+        <w:t xml:space="preserve">Transforma el modelo UML en un proyecto Spring Boot completo (Entity, Repository, Service, Controller) y en un archivo XMI. El proyecto generado incluye además una colección Postman, los scripts SQL de esquema (schema.sql) y de datos de prueba (data.sql), y la documentación Swagger de la API.</w:t>
       </w:r>
     </w:p>
     <w:p>

</xml_diff>